<commit_message>
Add integrated local DevOps lab and INT333 report
Co-authored-by: Copilot <223556219+Copilot@users.noreply.github.com>
</commit_message>
<xml_diff>
--- a/static/AI_Resume_Analyzer_Project_Report.docx
+++ b/static/AI_Resume_Analyzer_Project_Report.docx
@@ -4,7 +4,7 @@
   <w:body>
     <w:p>
       <w:pPr>
-        <w:spacing w:before="1680"/>
+        <w:spacing w:before="1500"/>
         <w:jc w:val="center"/>
       </w:pPr>
       <w:r>
@@ -18,16 +18,14 @@
     </w:p>
     <w:p>
       <w:pPr>
-        <w:spacing w:before="560"/>
         <w:jc w:val="center"/>
       </w:pPr>
       <w:r>
         <w:rPr>
           <w:b/>
-          <w:color w:val="5F6F82"/>
           <w:sz w:val="26"/>
         </w:rPr>
-        <w:t>PROJECT REPORT</w:t>
+        <w:t>INT333 PROJECT REPORT</w:t>
       </w:r>
     </w:p>
     <w:p>
@@ -36,6 +34,9 @@
         <w:jc w:val="center"/>
       </w:pPr>
       <w:r>
+        <w:rPr>
+          <w:sz w:val="60"/>
+        </w:rPr>
         <w:t>AI Resume Analyzer</w:t>
       </w:r>
     </w:p>
@@ -45,43 +46,38 @@
       </w:pPr>
       <w:r>
         <w:rPr>
-          <w:i/>
-          <w:color w:val="4B5B70"/>
           <w:sz w:val="26"/>
         </w:rPr>
-        <w:t>AI-powered resume-to-job description analysis platform</w:t>
+        <w:t>AI application and integrated DevOps automation lab</w:t>
       </w:r>
     </w:p>
     <w:p>
       <w:pPr>
-        <w:spacing w:before="400"/>
         <w:jc w:val="center"/>
       </w:pPr>
       <w:r>
         <w:rPr>
           <w:b/>
-          <w:sz w:val="28"/>
+          <w:sz w:val="26"/>
         </w:rPr>
-        <w:t>INT333 - DevOps Project</w:t>
+        <w:t>Configuration Management and Automation</w:t>
       </w:r>
     </w:p>
     <w:tbl>
       <w:tblPr>
+        <w:tblStyle w:val="LightShading-Accent1"/>
         <w:tblW w:type="auto" w:w="0"/>
         <w:jc w:val="center"/>
-        <w:tblLayout w:type="fixed"/>
         <w:tblLook w:firstColumn="1" w:firstRow="1" w:lastColumn="0" w:lastRow="0" w:noHBand="0" w:noVBand="1" w:val="04A0"/>
       </w:tblPr>
       <w:tblGrid>
-        <w:gridCol w:w="2880"/>
-        <w:gridCol w:w="5472"/>
+        <w:gridCol w:w="4968"/>
+        <w:gridCol w:w="4968"/>
       </w:tblGrid>
       <w:tr>
         <w:tc>
           <w:tcPr>
-            <w:tcW w:type="dxa" w:w="2880"/>
-            <w:vAlign w:val="center"/>
-            <w:shd w:fill="EEF4F7"/>
+            <w:tcW w:type="dxa" w:w="4968"/>
           </w:tcPr>
           <w:p>
             <w:r>
@@ -94,9 +90,7 @@
         </w:tc>
         <w:tc>
           <w:tcPr>
-            <w:tcW w:type="dxa" w:w="5472"/>
-            <w:vAlign w:val="center"/>
-            <w:shd w:fill="EEF4F7"/>
+            <w:tcW w:type="dxa" w:w="4968"/>
           </w:tcPr>
           <w:p>
             <w:r>
@@ -108,9 +102,7 @@
       <w:tr>
         <w:tc>
           <w:tcPr>
-            <w:tcW w:type="dxa" w:w="2880"/>
-            <w:vAlign w:val="center"/>
-            <w:shd w:fill="EEF4F7"/>
+            <w:tcW w:type="dxa" w:w="4968"/>
           </w:tcPr>
           <w:p>
             <w:r>
@@ -123,9 +115,7 @@
         </w:tc>
         <w:tc>
           <w:tcPr>
-            <w:tcW w:type="dxa" w:w="5472"/>
-            <w:vAlign w:val="center"/>
-            <w:shd w:fill="EEF4F7"/>
+            <w:tcW w:type="dxa" w:w="4968"/>
           </w:tcPr>
           <w:p>
             <w:r>
@@ -137,9 +127,7 @@
       <w:tr>
         <w:tc>
           <w:tcPr>
-            <w:tcW w:type="dxa" w:w="2880"/>
-            <w:vAlign w:val="center"/>
-            <w:shd w:fill="EEF4F7"/>
+            <w:tcW w:type="dxa" w:w="4968"/>
           </w:tcPr>
           <w:p>
             <w:r>
@@ -152,9 +140,7 @@
         </w:tc>
         <w:tc>
           <w:tcPr>
-            <w:tcW w:type="dxa" w:w="5472"/>
-            <w:vAlign w:val="center"/>
-            <w:shd w:fill="EEF4F7"/>
+            <w:tcW w:type="dxa" w:w="4968"/>
           </w:tcPr>
           <w:p>
             <w:r>
@@ -166,9 +152,7 @@
       <w:tr>
         <w:tc>
           <w:tcPr>
-            <w:tcW w:type="dxa" w:w="2880"/>
-            <w:vAlign w:val="center"/>
-            <w:shd w:fill="EEF4F7"/>
+            <w:tcW w:type="dxa" w:w="4968"/>
           </w:tcPr>
           <w:p>
             <w:r>
@@ -181,9 +165,7 @@
         </w:tc>
         <w:tc>
           <w:tcPr>
-            <w:tcW w:type="dxa" w:w="5472"/>
-            <w:vAlign w:val="center"/>
-            <w:shd w:fill="EEF4F7"/>
+            <w:tcW w:type="dxa" w:w="4968"/>
           </w:tcPr>
           <w:p>
             <w:r>
@@ -195,9 +177,7 @@
       <w:tr>
         <w:tc>
           <w:tcPr>
-            <w:tcW w:type="dxa" w:w="2880"/>
-            <w:vAlign w:val="center"/>
-            <w:shd w:fill="EEF4F7"/>
+            <w:tcW w:type="dxa" w:w="4968"/>
           </w:tcPr>
           <w:p>
             <w:r>
@@ -210,9 +190,7 @@
         </w:tc>
         <w:tc>
           <w:tcPr>
-            <w:tcW w:type="dxa" w:w="5472"/>
-            <w:vAlign w:val="center"/>
-            <w:shd w:fill="EEF4F7"/>
+            <w:tcW w:type="dxa" w:w="4968"/>
           </w:tcPr>
           <w:p>
             <w:r>
@@ -224,9 +202,7 @@
       <w:tr>
         <w:tc>
           <w:tcPr>
-            <w:tcW w:type="dxa" w:w="2880"/>
-            <w:vAlign w:val="center"/>
-            <w:shd w:fill="EEF4F7"/>
+            <w:tcW w:type="dxa" w:w="4968"/>
           </w:tcPr>
           <w:p>
             <w:r>
@@ -239,9 +215,7 @@
         </w:tc>
         <w:tc>
           <w:tcPr>
-            <w:tcW w:type="dxa" w:w="5472"/>
-            <w:vAlign w:val="center"/>
-            <w:shd w:fill="EEF4F7"/>
+            <w:tcW w:type="dxa" w:w="4968"/>
           </w:tcPr>
           <w:p>
             <w:r>
@@ -253,9 +227,7 @@
       <w:tr>
         <w:tc>
           <w:tcPr>
-            <w:tcW w:type="dxa" w:w="2880"/>
-            <w:vAlign w:val="center"/>
-            <w:shd w:fill="EEF4F7"/>
+            <w:tcW w:type="dxa" w:w="4968"/>
           </w:tcPr>
           <w:p>
             <w:r>
@@ -268,9 +240,7 @@
         </w:tc>
         <w:tc>
           <w:tcPr>
-            <w:tcW w:type="dxa" w:w="5472"/>
-            <w:vAlign w:val="center"/>
-            <w:shd w:fill="EEF4F7"/>
+            <w:tcW w:type="dxa" w:w="4968"/>
           </w:tcPr>
           <w:p>
             <w:r>
@@ -295,689 +265,2403 @@
     </w:p>
     <w:p>
       <w:r>
-        <w:t>This report presents Careerly AI Resume Analyzer, a Flask web application that compares a PDF resume with a job description and returns a structured, AI-generated review. The system extracts PDF text in memory, removes common direct identifiers, requests consent before sending text to Groq, and presents an ATS-style score, matching and missing skills, strengths, weaknesses, and suggestions. A job-description optimizer can structure supplied text or create a clearly labeled general draft from a short role title. The project also demonstrates Docker packaging, GitHub Actions testing and image publication, a Render deployment blueprint, and supporting operational examples for Ansible, Terraform, Puppet, and Nagios. The report documents implementation, security considerations, testing, deployment, limitations, and future work.</w:t>
+        <w:t>Careerly AI Resume Analyzer is a Flask application that compares PDF resume text with job-description text and returns an AI-generated review. This INT333 project also implements a local DevOps lab aligned to the evaluation rubric: Terraform provisions a Docker network and three containers; Ansible connects to the monitoring container, applies Puppet configuration, validates and starts Nagios, and asserts the app health endpoint. Nagios periodically checks the application over the lab network. The Render deployment remains a separate managed-service deployment because Render does not expose its host for configuration management. This report describes the implementation, execution steps, verification, security boundaries, and evidence to capture.</w:t>
       </w:r>
     </w:p>
     <w:p>
       <w:r>
-        <w:rPr>
-          <w:b/>
-        </w:rPr>
-        <w:t xml:space="preserve">Keywords: </w:t>
+        <w:t>Keywords: Terraform, Ansible, Puppet, Nagios, Docker, GitHub Actions, Flask, CI/CD, configuration management.</w:t>
       </w:r>
+    </w:p>
+    <w:p>
+      <w:pPr>
+        <w:pStyle w:val="Heading1"/>
+      </w:pPr>
       <w:r>
-        <w:t>Resume analysis, Flask, Groq, Docker, GitHub Actions, CI/CD, Render, DevOps, privacy</w:t>
+        <w:t>1. Problem Selection and Relevance</w:t>
+      </w:r>
+    </w:p>
+    <w:p>
+      <w:pPr>
+        <w:pStyle w:val="Heading2"/>
+      </w:pPr>
+      <w:r>
+        <w:t>1.1 Problem statement</w:t>
       </w:r>
     </w:p>
     <w:p>
       <w:r>
-        <w:br w:type="page"/>
+        <w:t>Job seekers often have difficulty identifying how a resume aligns with a specific job posting. Reviewing skills and requirements manually is time-consuming and gives little structured feedback. A resume analyzer automates a first-pass comparison and presents an ATS-style score, overlapping skills, gaps, and actionable suggestions.</w:t>
       </w:r>
     </w:p>
     <w:p>
       <w:pPr>
-        <w:pStyle w:val="Heading1"/>
+        <w:pStyle w:val="Heading2"/>
       </w:pPr>
       <w:r>
-        <w:t>Table of Contents</w:t>
+        <w:t>1.2 Objectives and scope</w:t>
       </w:r>
     </w:p>
     <w:p>
       <w:pPr>
-        <w:spacing w:after="80"/>
+        <w:pStyle w:val="ListBullet"/>
       </w:pPr>
       <w:r>
-        <w:t>Abstract</w:t>
+        <w:t>Accept text-based PDF resumes and compare resume and role text.</w:t>
       </w:r>
     </w:p>
     <w:p>
       <w:pPr>
-        <w:spacing w:after="80"/>
+        <w:pStyle w:val="ListBullet"/>
       </w:pPr>
       <w:r>
-        <w:t>1. Introduction</w:t>
+        <w:t>Display a score, matched/missing skills, strengths, improvement areas, and suggestions.</w:t>
       </w:r>
     </w:p>
     <w:p>
       <w:pPr>
-        <w:spacing w:after="80"/>
+        <w:pStyle w:val="ListBullet"/>
       </w:pPr>
       <w:r>
-        <w:t>2. Requirements and Technology Stack</w:t>
+        <w:t>Provide job-description cleanup and clearly labeled general drafts for title-only input.</w:t>
       </w:r>
     </w:p>
     <w:p>
       <w:pPr>
-        <w:spacing w:after="80"/>
+        <w:pStyle w:val="ListBullet"/>
       </w:pPr>
       <w:r>
-        <w:t>3. System Architecture and Workflow</w:t>
+        <w:t>Demonstrate repeatable provisioning, configuration automation, monitoring, and CI/CD.</w:t>
       </w:r>
     </w:p>
     <w:p>
-      <w:pPr>
-        <w:spacing w:after="80"/>
-      </w:pPr>
       <w:r>
-        <w:t>4. Application Implementation</w:t>
+        <w:t>This is an advisory prototype, not a commercial ATS or recruitment decision. It does not submit job applications or guarantee a score. Scanned-image PDFs are not OCR-processed. AI output can be inaccurate and should be reviewed.</w:t>
       </w:r>
     </w:p>
     <w:p>
       <w:pPr>
-        <w:spacing w:after="80"/>
+        <w:pStyle w:val="Heading1"/>
       </w:pPr>
       <w:r>
-        <w:t>5. DevOps, CI/CD, and Deployment</w:t>
+        <w:t>2. Architecture and Configuration-Management Design</w:t>
       </w:r>
     </w:p>
     <w:p>
       <w:pPr>
-        <w:spacing w:after="80"/>
+        <w:pStyle w:val="Heading2"/>
       </w:pPr>
       <w:r>
-        <w:t>6. Security and Privacy</w:t>
+        <w:t>2.1 Architecture overview</w:t>
       </w:r>
     </w:p>
     <w:p>
-      <w:pPr>
-        <w:spacing w:after="80"/>
-      </w:pPr>
       <w:r>
-        <w:t>7. Testing and Verification</w:t>
+        <w:t>The Flask application runs as a Docker web service on Render. A separate disposable local Docker lab demonstrates the required DevOps tools without implying access to Render internals.</w:t>
       </w:r>
     </w:p>
     <w:p>
       <w:pPr>
-        <w:spacing w:after="80"/>
+        <w:pStyle w:val="ReportCode"/>
       </w:pPr>
       <w:r>
-        <w:t>8. Installation and Operation</w:t>
+        <w:t>Browser -&gt; Flask app -&gt; PDF text extraction / identifier redaction -&gt; Groq API</w:t>
       </w:r>
     </w:p>
     <w:p>
       <w:pPr>
-        <w:spacing w:after="80"/>
+        <w:pStyle w:val="ReportCode"/>
       </w:pPr>
       <w:r>
-        <w:t>9. Future Enhancements</w:t>
+        <w:t xml:space="preserve">                                     -&gt; structured analysis -&gt; results UI</w:t>
       </w:r>
     </w:p>
     <w:p>
       <w:pPr>
-        <w:spacing w:after="80"/>
+        <w:pStyle w:val="ReportCode"/>
       </w:pPr>
       <w:r>
-        <w:t>10. Conclusion</w:t>
+        <w:t xml:space="preserve"> </w:t>
       </w:r>
     </w:p>
     <w:p>
       <w:pPr>
-        <w:spacing w:after="80"/>
+        <w:pStyle w:val="ReportCode"/>
+      </w:pPr>
+      <w:r>
+        <w:t>Local lab:</w:t>
+      </w:r>
+    </w:p>
+    <w:p>
+      <w:pPr>
+        <w:pStyle w:val="ReportCode"/>
+      </w:pPr>
+      <w:r>
+        <w:t>Terraform -&gt; Docker network + app + monitoring node + Ansible controller</w:t>
+      </w:r>
+    </w:p>
+    <w:p>
+      <w:pPr>
+        <w:pStyle w:val="ReportCode"/>
+      </w:pPr>
+      <w:r>
+        <w:t>Ansible -&gt; Puppet apply -&gt; Nagios config/services -&gt; app health assertion</w:t>
+      </w:r>
+    </w:p>
+    <w:tbl>
+      <w:tblPr>
+        <w:tblStyle w:val="LightShading-Accent1"/>
+        <w:tblW w:type="auto" w:w="0"/>
+        <w:jc w:val="center"/>
+        <w:tblLook w:firstColumn="1" w:firstRow="1" w:lastColumn="0" w:lastRow="0" w:noHBand="0" w:noVBand="1" w:val="04A0"/>
+      </w:tblPr>
+      <w:tblGrid>
+        <w:gridCol w:w="3312"/>
+        <w:gridCol w:w="3312"/>
+        <w:gridCol w:w="3312"/>
+      </w:tblGrid>
+      <w:tr>
+        <w:tc>
+          <w:tcPr>
+            <w:tcW w:type="dxa" w:w="3312"/>
+          </w:tcPr>
+          <w:p>
+            <w:r>
+              <w:rPr>
+                <w:b/>
+              </w:rPr>
+              <w:t>Layer</w:t>
+            </w:r>
+          </w:p>
+        </w:tc>
+        <w:tc>
+          <w:tcPr>
+            <w:tcW w:type="dxa" w:w="3312"/>
+          </w:tcPr>
+          <w:p>
+            <w:r>
+              <w:rPr>
+                <w:b/>
+              </w:rPr>
+              <w:t>Implementation</w:t>
+            </w:r>
+          </w:p>
+        </w:tc>
+        <w:tc>
+          <w:tcPr>
+            <w:tcW w:type="dxa" w:w="3312"/>
+          </w:tcPr>
+          <w:p>
+            <w:r>
+              <w:rPr>
+                <w:b/>
+              </w:rPr>
+              <w:t>Responsibility</w:t>
+            </w:r>
+          </w:p>
+        </w:tc>
+      </w:tr>
+      <w:tr>
+        <w:tc>
+          <w:tcPr>
+            <w:tcW w:type="dxa" w:w="3312"/>
+          </w:tcPr>
+          <w:p>
+            <w:r>
+              <w:t>Application</w:t>
+            </w:r>
+          </w:p>
+        </w:tc>
+        <w:tc>
+          <w:tcPr>
+            <w:tcW w:type="dxa" w:w="3312"/>
+          </w:tcPr>
+          <w:p>
+            <w:r>
+              <w:t>Flask + HTML/CSS/JavaScript</w:t>
+            </w:r>
+          </w:p>
+        </w:tc>
+        <w:tc>
+          <w:tcPr>
+            <w:tcW w:type="dxa" w:w="3312"/>
+          </w:tcPr>
+          <w:p>
+            <w:r>
+              <w:t>Input, validation, AI request, result rendering.</w:t>
+            </w:r>
+          </w:p>
+        </w:tc>
+      </w:tr>
+      <w:tr>
+        <w:tc>
+          <w:tcPr>
+            <w:tcW w:type="dxa" w:w="3312"/>
+          </w:tcPr>
+          <w:p>
+            <w:r>
+              <w:t>Image</w:t>
+            </w:r>
+          </w:p>
+        </w:tc>
+        <w:tc>
+          <w:tcPr>
+            <w:tcW w:type="dxa" w:w="3312"/>
+          </w:tcPr>
+          <w:p>
+            <w:r>
+              <w:t>Dockerfile</w:t>
+            </w:r>
+          </w:p>
+        </w:tc>
+        <w:tc>
+          <w:tcPr>
+            <w:tcW w:type="dxa" w:w="3312"/>
+          </w:tcPr>
+          <w:p>
+            <w:r>
+              <w:t>Reproducible app runtime; secrets supplied at runtime.</w:t>
+            </w:r>
+          </w:p>
+        </w:tc>
+      </w:tr>
+      <w:tr>
+        <w:tc>
+          <w:tcPr>
+            <w:tcW w:type="dxa" w:w="3312"/>
+          </w:tcPr>
+          <w:p>
+            <w:r>
+              <w:t>Provisioning</w:t>
+            </w:r>
+          </w:p>
+        </w:tc>
+        <w:tc>
+          <w:tcPr>
+            <w:tcW w:type="dxa" w:w="3312"/>
+          </w:tcPr>
+          <w:p>
+            <w:r>
+              <w:t>Terraform Docker provider</w:t>
+            </w:r>
+          </w:p>
+        </w:tc>
+        <w:tc>
+          <w:tcPr>
+            <w:tcW w:type="dxa" w:w="3312"/>
+          </w:tcPr>
+          <w:p>
+            <w:r>
+              <w:t>Images, isolated network, containers, and outputs.</w:t>
+            </w:r>
+          </w:p>
+        </w:tc>
+      </w:tr>
+      <w:tr>
+        <w:tc>
+          <w:tcPr>
+            <w:tcW w:type="dxa" w:w="3312"/>
+          </w:tcPr>
+          <w:p>
+            <w:r>
+              <w:t>Orchestration</w:t>
+            </w:r>
+          </w:p>
+        </w:tc>
+        <w:tc>
+          <w:tcPr>
+            <w:tcW w:type="dxa" w:w="3312"/>
+          </w:tcPr>
+          <w:p>
+            <w:r>
+              <w:t>Ansible controller</w:t>
+            </w:r>
+          </w:p>
+        </w:tc>
+        <w:tc>
+          <w:tcPr>
+            <w:tcW w:type="dxa" w:w="3312"/>
+          </w:tcPr>
+          <w:p>
+            <w:r>
+              <w:t>Monitoring configuration and post-deploy checks.</w:t>
+            </w:r>
+          </w:p>
+        </w:tc>
+      </w:tr>
+      <w:tr>
+        <w:tc>
+          <w:tcPr>
+            <w:tcW w:type="dxa" w:w="3312"/>
+          </w:tcPr>
+          <w:p>
+            <w:r>
+              <w:t>Configuration</w:t>
+            </w:r>
+          </w:p>
+        </w:tc>
+        <w:tc>
+          <w:tcPr>
+            <w:tcW w:type="dxa" w:w="3312"/>
+          </w:tcPr>
+          <w:p>
+            <w:r>
+              <w:t>Puppet module</w:t>
+            </w:r>
+          </w:p>
+        </w:tc>
+        <w:tc>
+          <w:tcPr>
+            <w:tcW w:type="dxa" w:w="3312"/>
+          </w:tcPr>
+          <w:p>
+            <w:r>
+              <w:t>Nagios plugin, config template, and service state.</w:t>
+            </w:r>
+          </w:p>
+        </w:tc>
+      </w:tr>
+      <w:tr>
+        <w:tc>
+          <w:tcPr>
+            <w:tcW w:type="dxa" w:w="3312"/>
+          </w:tcPr>
+          <w:p>
+            <w:r>
+              <w:t>Monitoring</w:t>
+            </w:r>
+          </w:p>
+        </w:tc>
+        <w:tc>
+          <w:tcPr>
+            <w:tcW w:type="dxa" w:w="3312"/>
+          </w:tcPr>
+          <w:p>
+            <w:r>
+              <w:t>Nagios Core + check_http</w:t>
+            </w:r>
+          </w:p>
+        </w:tc>
+        <w:tc>
+          <w:tcPr>
+            <w:tcW w:type="dxa" w:w="3312"/>
+          </w:tcPr>
+          <w:p>
+            <w:r>
+              <w:t>Poll /health and classify availability/latency.</w:t>
+            </w:r>
+          </w:p>
+        </w:tc>
+      </w:tr>
+      <w:tr>
+        <w:tc>
+          <w:tcPr>
+            <w:tcW w:type="dxa" w:w="3312"/>
+          </w:tcPr>
+          <w:p>
+            <w:r>
+              <w:t>Hosted deployment</w:t>
+            </w:r>
+          </w:p>
+        </w:tc>
+        <w:tc>
+          <w:tcPr>
+            <w:tcW w:type="dxa" w:w="3312"/>
+          </w:tcPr>
+          <w:p>
+            <w:r>
+              <w:t>Render Blueprint</w:t>
+            </w:r>
+          </w:p>
+        </w:tc>
+        <w:tc>
+          <w:tcPr>
+            <w:tcW w:type="dxa" w:w="3312"/>
+          </w:tcPr>
+          <w:p>
+            <w:r>
+              <w:t>Managed app service and /health check.</w:t>
+            </w:r>
+          </w:p>
+        </w:tc>
+      </w:tr>
+    </w:tbl>
+    <w:p/>
+    <w:p>
+      <w:pPr>
+        <w:pStyle w:val="Heading2"/>
+      </w:pPr>
+      <w:r>
+        <w:t>2.2 Design decisions</w:t>
+      </w:r>
+    </w:p>
+    <w:p>
+      <w:pPr>
+        <w:pStyle w:val="ListBullet"/>
+      </w:pPr>
+      <w:r>
+        <w:t>Use a local Docker lab to avoid cloud bills while demonstrating real resources.</w:t>
+      </w:r>
+    </w:p>
+    <w:p>
+      <w:pPr>
+        <w:pStyle w:val="ListBullet"/>
+      </w:pPr>
+      <w:r>
+        <w:t>Keep Render separate: it provides no SSH or host-level configuration access.</w:t>
+      </w:r>
+    </w:p>
+    <w:p>
+      <w:pPr>
+        <w:pStyle w:val="ListBullet"/>
+      </w:pPr>
+      <w:r>
+        <w:t>Use community.docker.docker so Ansible configures the monitoring container without SSH.</w:t>
+      </w:r>
+    </w:p>
+    <w:p>
+      <w:pPr>
+        <w:pStyle w:val="ListBullet"/>
+      </w:pPr>
+      <w:r>
+        <w:t>Puppet owns Nagios desired state; Ansible owns orchestration, validation, and app checks.</w:t>
+      </w:r>
+    </w:p>
+    <w:p>
+      <w:pPr>
+        <w:pStyle w:val="ListBullet"/>
+      </w:pPr>
+      <w:r>
+        <w:t>Bind published lab ports only to 127.0.0.1. Keep Terraform state out of Git.</w:t>
+      </w:r>
+    </w:p>
+    <w:p>
+      <w:pPr>
+        <w:pStyle w:val="Heading2"/>
+      </w:pPr>
+      <w:r>
+        <w:t>2.3 Repository components</w:t>
+      </w:r>
+    </w:p>
+    <w:tbl>
+      <w:tblPr>
+        <w:tblStyle w:val="LightShading-Accent1"/>
+        <w:tblW w:type="auto" w:w="0"/>
+        <w:jc w:val="center"/>
+        <w:tblLook w:firstColumn="1" w:firstRow="1" w:lastColumn="0" w:lastRow="0" w:noHBand="0" w:noVBand="1" w:val="04A0"/>
+      </w:tblPr>
+      <w:tblGrid>
+        <w:gridCol w:w="4968"/>
+        <w:gridCol w:w="4968"/>
+      </w:tblGrid>
+      <w:tr>
+        <w:tc>
+          <w:tcPr>
+            <w:tcW w:type="dxa" w:w="4968"/>
+          </w:tcPr>
+          <w:p>
+            <w:r>
+              <w:rPr>
+                <w:b/>
+              </w:rPr>
+              <w:t>Path</w:t>
+            </w:r>
+          </w:p>
+        </w:tc>
+        <w:tc>
+          <w:tcPr>
+            <w:tcW w:type="dxa" w:w="4968"/>
+          </w:tcPr>
+          <w:p>
+            <w:r>
+              <w:rPr>
+                <w:b/>
+              </w:rPr>
+              <w:t>Purpose</w:t>
+            </w:r>
+          </w:p>
+        </w:tc>
+      </w:tr>
+      <w:tr>
+        <w:tc>
+          <w:tcPr>
+            <w:tcW w:type="dxa" w:w="4968"/>
+          </w:tcPr>
+          <w:p>
+            <w:r>
+              <w:t>terraform/main.tf</w:t>
+            </w:r>
+          </w:p>
+        </w:tc>
+        <w:tc>
+          <w:tcPr>
+            <w:tcW w:type="dxa" w:w="4968"/>
+          </w:tcPr>
+          <w:p>
+            <w:r>
+              <w:t>Docker resources, network, containers, Ansible provisioner, outputs.</w:t>
+            </w:r>
+          </w:p>
+        </w:tc>
+      </w:tr>
+      <w:tr>
+        <w:tc>
+          <w:tcPr>
+            <w:tcW w:type="dxa" w:w="4968"/>
+          </w:tcPr>
+          <w:p>
+            <w:r>
+              <w:t>ansible/Dockerfile</w:t>
+            </w:r>
+          </w:p>
+        </w:tc>
+        <w:tc>
+          <w:tcPr>
+            <w:tcW w:type="dxa" w:w="4968"/>
+          </w:tcPr>
+          <w:p>
+            <w:r>
+              <w:t>Controller image with ansible-core, Docker SDK, and community.docker.</w:t>
+            </w:r>
+          </w:p>
+        </w:tc>
+      </w:tr>
+      <w:tr>
+        <w:tc>
+          <w:tcPr>
+            <w:tcW w:type="dxa" w:w="4968"/>
+          </w:tcPr>
+          <w:p>
+            <w:r>
+              <w:t>ansible/playbooks/lab-inventory.yml</w:t>
+            </w:r>
+          </w:p>
+        </w:tc>
+        <w:tc>
+          <w:tcPr>
+            <w:tcW w:type="dxa" w:w="4968"/>
+          </w:tcPr>
+          <w:p>
+            <w:r>
+              <w:t>Monitoring Docker connection and local health-check target.</w:t>
+            </w:r>
+          </w:p>
+        </w:tc>
+      </w:tr>
+      <w:tr>
+        <w:tc>
+          <w:tcPr>
+            <w:tcW w:type="dxa" w:w="4968"/>
+          </w:tcPr>
+          <w:p>
+            <w:r>
+              <w:t>ansible/playbooks/configure-and-verify.yml</w:t>
+            </w:r>
+          </w:p>
+        </w:tc>
+        <w:tc>
+          <w:tcPr>
+            <w:tcW w:type="dxa" w:w="4968"/>
+          </w:tcPr>
+          <w:p>
+            <w:r>
+              <w:t>Puppet apply, Nagios validation/services, app health assertion.</w:t>
+            </w:r>
+          </w:p>
+        </w:tc>
+      </w:tr>
+      <w:tr>
+        <w:tc>
+          <w:tcPr>
+            <w:tcW w:type="dxa" w:w="4968"/>
+          </w:tcPr>
+          <w:p>
+            <w:r>
+              <w:t>puppet/modules/resume_analyzer_monitoring/</w:t>
+            </w:r>
+          </w:p>
+        </w:tc>
+        <w:tc>
+          <w:tcPr>
+            <w:tcW w:type="dxa" w:w="4968"/>
+          </w:tcPr>
+          <w:p>
+            <w:r>
+              <w:t>Puppet class and ERB template for Nagios objects.</w:t>
+            </w:r>
+          </w:p>
+        </w:tc>
+      </w:tr>
+      <w:tr>
+        <w:tc>
+          <w:tcPr>
+            <w:tcW w:type="dxa" w:w="4968"/>
+          </w:tcPr>
+          <w:p>
+            <w:r>
+              <w:t>nagios/Dockerfile</w:t>
+            </w:r>
+          </w:p>
+        </w:tc>
+        <w:tc>
+          <w:tcPr>
+            <w:tcW w:type="dxa" w:w="4968"/>
+          </w:tcPr>
+          <w:p>
+            <w:r>
+              <w:t>Local Nagios/Apache/Puppet runtime image.</w:t>
+            </w:r>
+          </w:p>
+        </w:tc>
+      </w:tr>
+      <w:tr>
+        <w:tc>
+          <w:tcPr>
+            <w:tcW w:type="dxa" w:w="4968"/>
+          </w:tcPr>
+          <w:p>
+            <w:r>
+              <w:t>render.yaml</w:t>
+            </w:r>
+          </w:p>
+        </w:tc>
+        <w:tc>
+          <w:tcPr>
+            <w:tcW w:type="dxa" w:w="4968"/>
+          </w:tcPr>
+          <w:p>
+            <w:r>
+              <w:t>Separate Render service and health endpoint declaration.</w:t>
+            </w:r>
+          </w:p>
+        </w:tc>
+      </w:tr>
+    </w:tbl>
+    <w:p/>
+    <w:p>
+      <w:pPr>
+        <w:pStyle w:val="Heading1"/>
+      </w:pPr>
+      <w:r>
+        <w:t>3. Terraform Infrastructure as Code (15 marks)</w:t>
+      </w:r>
+    </w:p>
+    <w:p>
+      <w:pPr>
+        <w:pStyle w:val="Heading2"/>
+      </w:pPr>
+      <w:r>
+        <w:t>3.1 Provider and resources</w:t>
+      </w:r>
+    </w:p>
+    <w:p>
+      <w:r>
+        <w:t>The root module requires Terraform &gt;= 1.5.0 and pins kreuzwerker/docker to the ~&gt; 3.0 range; .terraform.lock.hcl records the selected provider checksum/version. The provider reads DOCKER_HOST. The module defines a bridge network, builds the application, Ansible, and monitoring images, and creates three containers with stable names and network aliases. App port 5000 and Nagios port 8080 bind to loopback only.</w:t>
+      </w:r>
+    </w:p>
+    <w:p>
+      <w:pPr>
+        <w:pStyle w:val="ListBullet"/>
+      </w:pPr>
+      <w:r>
+        <w:t>docker_network.lab creates the isolated resume-analyzer-devops-lab network.</w:t>
+      </w:r>
+    </w:p>
+    <w:p>
+      <w:pPr>
+        <w:pStyle w:val="ListBullet"/>
+      </w:pPr>
+      <w:r>
+        <w:t>docker_image resources build the app, Ansible controller, and monitoring images.</w:t>
+      </w:r>
+    </w:p>
+    <w:p>
+      <w:pPr>
+        <w:pStyle w:val="ListBullet"/>
+      </w:pPr>
+      <w:r>
+        <w:t>docker_container resources launch the three lab services with network aliases.</w:t>
+      </w:r>
+    </w:p>
+    <w:p>
+      <w:pPr>
+        <w:pStyle w:val="ListBullet"/>
+      </w:pPr>
+      <w:r>
+        <w:t>terraform_data.ansible_provisioning runs Ansible after containers exist and re-runs on replacement.</w:t>
+      </w:r>
+    </w:p>
+    <w:p>
+      <w:pPr>
+        <w:pStyle w:val="ListBullet"/>
+      </w:pPr>
+      <w:r>
+        <w:t>Terraform destroy removes managed containers/network; locally retained images are not removed.</w:t>
+      </w:r>
+    </w:p>
+    <w:p>
+      <w:pPr>
+        <w:pStyle w:val="Heading2"/>
+      </w:pPr>
+      <w:r>
+        <w:t>3.2 Commands</w:t>
+      </w:r>
+    </w:p>
+    <w:p>
+      <w:pPr>
+        <w:pStyle w:val="ReportCode"/>
+      </w:pPr>
+      <w:r>
+        <w:t>$env:DOCKER_HOST = 'npipe:////./pipe/dockerDesktopLinuxEngine'</w:t>
+      </w:r>
+    </w:p>
+    <w:p>
+      <w:pPr>
+        <w:pStyle w:val="ReportCode"/>
+      </w:pPr>
+      <w:r>
+        <w:t>docker info</w:t>
+      </w:r>
+    </w:p>
+    <w:p>
+      <w:pPr>
+        <w:pStyle w:val="ReportCode"/>
+      </w:pPr>
+      <w:r>
+        <w:t>terraform -chdir=terraform init</w:t>
+      </w:r>
+    </w:p>
+    <w:p>
+      <w:pPr>
+        <w:pStyle w:val="ReportCode"/>
+      </w:pPr>
+      <w:r>
+        <w:t>terraform -chdir=terraform fmt -check</w:t>
+      </w:r>
+    </w:p>
+    <w:p>
+      <w:pPr>
+        <w:pStyle w:val="ReportCode"/>
+      </w:pPr>
+      <w:r>
+        <w:t>terraform -chdir=terraform validate</w:t>
+      </w:r>
+    </w:p>
+    <w:p>
+      <w:pPr>
+        <w:pStyle w:val="ReportCode"/>
+      </w:pPr>
+      <w:r>
+        <w:t>terraform -chdir=terraform plan</w:t>
+      </w:r>
+    </w:p>
+    <w:p>
+      <w:pPr>
+        <w:pStyle w:val="ReportCode"/>
+      </w:pPr>
+      <w:r>
+        <w:t>terraform -chdir=terraform apply</w:t>
+      </w:r>
+    </w:p>
+    <w:p>
+      <w:pPr>
+        <w:pStyle w:val="ReportCode"/>
+      </w:pPr>
+      <w:r>
+        <w:t>terraform -chdir=terraform output</w:t>
+      </w:r>
+    </w:p>
+    <w:p>
+      <w:pPr>
+        <w:pStyle w:val="ReportCode"/>
+      </w:pPr>
+      <w:r>
+        <w:t>terraform -chdir=terraform destroy</w:t>
+      </w:r>
+    </w:p>
+    <w:p>
+      <w:pPr>
+        <w:pStyle w:val="ReportCode"/>
+      </w:pPr>
+      <w:r>
+        <w:t xml:space="preserve"> </w:t>
+      </w:r>
+    </w:p>
+    <w:p>
+      <w:pPr>
+        <w:pStyle w:val="ReportCode"/>
+      </w:pPr>
+      <w:r>
+        <w:t># Linux Docker Engine</w:t>
+      </w:r>
+    </w:p>
+    <w:p>
+      <w:pPr>
+        <w:pStyle w:val="ReportCode"/>
+      </w:pPr>
+      <w:r>
+        <w:t>export DOCKER_HOST=unix:///var/run/docker.sock</w:t>
+      </w:r>
+    </w:p>
+    <w:p>
+      <w:r>
+        <w:t>Terraform does not automatically resolve Docker Desktop’s named context; DOCKER_HOST must point to the engine. Docker Desktop must use Linux containers. Keep state, local plans, tfvars, and credentials private.</w:t>
+      </w:r>
+    </w:p>
+    <w:p>
+      <w:pPr>
+        <w:pStyle w:val="Heading1"/>
+      </w:pPr>
+      <w:r>
+        <w:t>4. Ansible Automation and Playbooks (15 marks)</w:t>
+      </w:r>
+    </w:p>
+    <w:p>
+      <w:pPr>
+        <w:pStyle w:val="Heading2"/>
+      </w:pPr>
+      <w:r>
+        <w:t>4.1 Controller and inventory</w:t>
+      </w:r>
+    </w:p>
+    <w:p>
+      <w:r>
+        <w:t>ansible/Dockerfile builds an ephemeral control node and installs ansible-core, Docker SDK, and community.docker. The inventory assigns the monitoring container to the Docker connection plugin and localhost to a local connection. The controller needs the Docker socket for this plugin.</w:t>
+      </w:r>
+    </w:p>
+    <w:p>
+      <w:pPr>
+        <w:pStyle w:val="ReportCode"/>
+      </w:pPr>
+      <w:r>
+        <w:t>all:</w:t>
+      </w:r>
+    </w:p>
+    <w:p>
+      <w:pPr>
+        <w:pStyle w:val="ReportCode"/>
+      </w:pPr>
+      <w:r>
+        <w:t xml:space="preserve">  children:</w:t>
+      </w:r>
+    </w:p>
+    <w:p>
+      <w:pPr>
+        <w:pStyle w:val="ReportCode"/>
+      </w:pPr>
+      <w:r>
+        <w:t xml:space="preserve">    monitoring:</w:t>
+      </w:r>
+    </w:p>
+    <w:p>
+      <w:pPr>
+        <w:pStyle w:val="ReportCode"/>
+      </w:pPr>
+      <w:r>
+        <w:t xml:space="preserve">      hosts:</w:t>
+      </w:r>
+    </w:p>
+    <w:p>
+      <w:pPr>
+        <w:pStyle w:val="ReportCode"/>
+      </w:pPr>
+      <w:r>
+        <w:t xml:space="preserve">        resume_analyzer_monitoring:</w:t>
+      </w:r>
+    </w:p>
+    <w:p>
+      <w:pPr>
+        <w:pStyle w:val="ReportCode"/>
+      </w:pPr>
+      <w:r>
+        <w:t xml:space="preserve">          ansible_connection: community.docker.docker</w:t>
+      </w:r>
+    </w:p>
+    <w:p>
+      <w:pPr>
+        <w:pStyle w:val="ReportCode"/>
+      </w:pPr>
+      <w:r>
+        <w:t xml:space="preserve">          ansible_host: resume-analyzer-monitoring</w:t>
+      </w:r>
+    </w:p>
+    <w:p>
+      <w:pPr>
+        <w:pStyle w:val="Heading2"/>
+      </w:pPr>
+      <w:r>
+        <w:t>4.2 Playbook and failure behavior</w:t>
+      </w:r>
+    </w:p>
+    <w:p>
+      <w:r>
+        <w:t>configure-and-verify.yml runs Puppet apply in the monitoring container, validates Nagios with nagios4 -v, and restarts Nagios/Apache. A localhost play retries the app health request up to ten times, requires HTTP 200, and asserts health.json.status == ok. A failed configuration, invalid Nagios config, unavailable Docker API, or unhealthy app fails the Terraform provisioner.</w:t>
+      </w:r>
+    </w:p>
+    <w:p>
+      <w:pPr>
+        <w:pStyle w:val="ReportCode"/>
+      </w:pPr>
+      <w:r>
+        <w:t>ansible-playbook -i /playbooks/lab-inventory.yml \</w:t>
+      </w:r>
+    </w:p>
+    <w:p>
+      <w:pPr>
+        <w:pStyle w:val="ReportCode"/>
+      </w:pPr>
+      <w:r>
+        <w:t xml:space="preserve">  /playbooks/configure-and-verify.yml</w:t>
+      </w:r>
+    </w:p>
+    <w:p>
+      <w:r>
+        <w:t>check-render-health.yml remains available for an external Render health probe using SERVICE_URL. It checks the public endpoint only; it is not host configuration management.</w:t>
+      </w:r>
+    </w:p>
+    <w:p>
+      <w:pPr>
+        <w:pStyle w:val="Heading1"/>
+      </w:pPr>
+      <w:r>
+        <w:t>5. Puppet Implementation (15 marks)</w:t>
+      </w:r>
+    </w:p>
+    <w:p>
+      <w:pPr>
+        <w:pStyle w:val="Heading2"/>
+      </w:pPr>
+      <w:r>
+        <w:t>5.1 Desired state</w:t>
+      </w:r>
+    </w:p>
+    <w:p>
+      <w:r>
+        <w:t>puppet/modules/resume_analyzer_monitoring/manifests/init.pp defines package, file, and service resources. It ensures nagios-plugins-basic is installed; writes /etc/nagios4/conf.d/resume-analyzer.cfg from an ERB template; and enables/runs nagios4 and apache2. Resource relationships require the package before the config file, and the config file before Nagios.</w:t>
+      </w:r>
+    </w:p>
+    <w:p>
+      <w:pPr>
+        <w:pStyle w:val="ReportCode"/>
+      </w:pPr>
+      <w:r>
+        <w:t>class resume_analyzer_monitoring {</w:t>
+      </w:r>
+    </w:p>
+    <w:p>
+      <w:pPr>
+        <w:pStyle w:val="ReportCode"/>
+      </w:pPr>
+      <w:r>
+        <w:t xml:space="preserve">  package { 'nagios-plugins-basic': ensure =&gt; installed }</w:t>
+      </w:r>
+    </w:p>
+    <w:p>
+      <w:pPr>
+        <w:pStyle w:val="ReportCode"/>
+      </w:pPr>
+      <w:r>
+        <w:t xml:space="preserve">  file { '/etc/nagios4/conf.d/resume-analyzer.cfg':</w:t>
+      </w:r>
+    </w:p>
+    <w:p>
+      <w:pPr>
+        <w:pStyle w:val="ReportCode"/>
+      </w:pPr>
+      <w:r>
+        <w:t xml:space="preserve">    ensure =&gt; file,</w:t>
+      </w:r>
+    </w:p>
+    <w:p>
+      <w:pPr>
+        <w:pStyle w:val="ReportCode"/>
+      </w:pPr>
+      <w:r>
+        <w:t xml:space="preserve">    content =&gt; template('resume_analyzer_monitoring/resume-analyzer.cfg.erb'),</w:t>
+      </w:r>
+    </w:p>
+    <w:p>
+      <w:pPr>
+        <w:pStyle w:val="ReportCode"/>
+      </w:pPr>
+      <w:r>
+        <w:t xml:space="preserve">    require =&gt; Package['nagios-plugins-basic'],</w:t>
+      </w:r>
+    </w:p>
+    <w:p>
+      <w:pPr>
+        <w:pStyle w:val="ReportCode"/>
+      </w:pPr>
+      <w:r>
+        <w:t xml:space="preserve">  }</w:t>
+      </w:r>
+    </w:p>
+    <w:p>
+      <w:pPr>
+        <w:pStyle w:val="ReportCode"/>
+      </w:pPr>
+      <w:r>
+        <w:t xml:space="preserve">  service { 'nagios4':</w:t>
+      </w:r>
+    </w:p>
+    <w:p>
+      <w:pPr>
+        <w:pStyle w:val="ReportCode"/>
+      </w:pPr>
+      <w:r>
+        <w:t xml:space="preserve">    ensure =&gt; running, enable =&gt; true,</w:t>
+      </w:r>
+    </w:p>
+    <w:p>
+      <w:pPr>
+        <w:pStyle w:val="ReportCode"/>
+      </w:pPr>
+      <w:r>
+        <w:t xml:space="preserve">    require =&gt; File['/etc/nagios4/conf.d/resume-analyzer.cfg'],</w:t>
+      </w:r>
+    </w:p>
+    <w:p>
+      <w:pPr>
+        <w:pStyle w:val="ReportCode"/>
+      </w:pPr>
+      <w:r>
+        <w:t xml:space="preserve">  }</w:t>
+      </w:r>
+    </w:p>
+    <w:p>
+      <w:pPr>
+        <w:pStyle w:val="ReportCode"/>
+      </w:pPr>
+      <w:r>
+        <w:t xml:space="preserve">  service { 'apache2': ensure =&gt; running, enable =&gt; true }</w:t>
+      </w:r>
+    </w:p>
+    <w:p>
+      <w:pPr>
+        <w:pStyle w:val="ReportCode"/>
+      </w:pPr>
+      <w:r>
+        <w:t>}</w:t>
+      </w:r>
+    </w:p>
+    <w:p>
+      <w:pPr>
+        <w:pStyle w:val="Heading2"/>
+      </w:pPr>
+      <w:r>
+        <w:t>5.2 Template-managed objects</w:t>
+      </w:r>
+    </w:p>
+    <w:p>
+      <w:r>
+        <w:t>The ERB template declares a standard check_http command, one app host, and one service. It checks port 5000 and /health, expects HTTP 200, uses 5/10-second warning/critical thresholds, and checks/retries every minute with three maximum attempts. The host resolves on the private Docker network.</w:t>
+      </w:r>
+    </w:p>
+    <w:p>
+      <w:pPr>
+        <w:pStyle w:val="ReportCode"/>
+      </w:pPr>
+      <w:r>
+        <w:t>define command {</w:t>
+      </w:r>
+    </w:p>
+    <w:p>
+      <w:pPr>
+        <w:pStyle w:val="ReportCode"/>
+      </w:pPr>
+      <w:r>
+        <w:t xml:space="preserve">  command_name check_resume_analyzer_health</w:t>
+      </w:r>
+    </w:p>
+    <w:p>
+      <w:pPr>
+        <w:pStyle w:val="ReportCode"/>
+      </w:pPr>
+      <w:r>
+        <w:t xml:space="preserve">  command_line $USER1$/check_http -H $HOSTADDRESS$ -p 5000 -u /health -e 200 -w 5 -c 10</w:t>
+      </w:r>
+    </w:p>
+    <w:p>
+      <w:pPr>
+        <w:pStyle w:val="ReportCode"/>
+      </w:pPr>
+      <w:r>
+        <w:t>}</w:t>
+      </w:r>
+    </w:p>
+    <w:p>
+      <w:pPr>
+        <w:pStyle w:val="ReportCode"/>
+      </w:pPr>
+      <w:r>
+        <w:t>define host {</w:t>
+      </w:r>
+    </w:p>
+    <w:p>
+      <w:pPr>
+        <w:pStyle w:val="ReportCode"/>
+      </w:pPr>
+      <w:r>
+        <w:t xml:space="preserve">  use generic-host</w:t>
+      </w:r>
+    </w:p>
+    <w:p>
+      <w:pPr>
+        <w:pStyle w:val="ReportCode"/>
+      </w:pPr>
+      <w:r>
+        <w:t xml:space="preserve">  host_name resume-analyzer-app</w:t>
+      </w:r>
+    </w:p>
+    <w:p>
+      <w:pPr>
+        <w:pStyle w:val="ReportCode"/>
+      </w:pPr>
+      <w:r>
+        <w:t xml:space="preserve">  address resume-analyzer-app</w:t>
+      </w:r>
+    </w:p>
+    <w:p>
+      <w:pPr>
+        <w:pStyle w:val="ReportCode"/>
+      </w:pPr>
+      <w:r>
+        <w:t xml:space="preserve">  max_check_attempts 3</w:t>
+      </w:r>
+    </w:p>
+    <w:p>
+      <w:pPr>
+        <w:pStyle w:val="ReportCode"/>
+      </w:pPr>
+      <w:r>
+        <w:t>}</w:t>
+      </w:r>
+    </w:p>
+    <w:p>
+      <w:pPr>
+        <w:pStyle w:val="ReportCode"/>
+      </w:pPr>
+      <w:r>
+        <w:t>define service {</w:t>
+      </w:r>
+    </w:p>
+    <w:p>
+      <w:pPr>
+        <w:pStyle w:val="ReportCode"/>
+      </w:pPr>
+      <w:r>
+        <w:t xml:space="preserve">  use generic-service</w:t>
+      </w:r>
+    </w:p>
+    <w:p>
+      <w:pPr>
+        <w:pStyle w:val="ReportCode"/>
+      </w:pPr>
+      <w:r>
+        <w:t xml:space="preserve">  host_name resume-analyzer-app</w:t>
+      </w:r>
+    </w:p>
+    <w:p>
+      <w:pPr>
+        <w:pStyle w:val="ReportCode"/>
+      </w:pPr>
+      <w:r>
+        <w:t xml:space="preserve">  service_description Flask health endpoint</w:t>
+      </w:r>
+    </w:p>
+    <w:p>
+      <w:pPr>
+        <w:pStyle w:val="ReportCode"/>
+      </w:pPr>
+      <w:r>
+        <w:t xml:space="preserve">  check_command check_resume_analyzer_health</w:t>
+      </w:r>
+    </w:p>
+    <w:p>
+      <w:pPr>
+        <w:pStyle w:val="ReportCode"/>
+      </w:pPr>
+      <w:r>
+        <w:t>}</w:t>
+      </w:r>
+    </w:p>
+    <w:p>
+      <w:pPr>
+        <w:pStyle w:val="Heading2"/>
+      </w:pPr>
+      <w:r>
+        <w:t>5.3 Apply and validate</w:t>
+      </w:r>
+    </w:p>
+    <w:p>
+      <w:r>
+        <w:t>Ansible invokes puppet apply after the monitoring container starts. It then validates Nagios and restarts services. Reapplying Puppet should converge to the declared state rather than accumulate manual edits.</w:t>
+      </w:r>
+    </w:p>
+    <w:p>
+      <w:pPr>
+        <w:pStyle w:val="ReportCode"/>
+      </w:pPr>
+      <w:r>
+        <w:t>puppet parser validate puppet/modules/resume_analyzer_monitoring/manifests/init.pp</w:t>
+      </w:r>
+    </w:p>
+    <w:p>
+      <w:pPr>
+        <w:pStyle w:val="ReportCode"/>
+      </w:pPr>
+      <w:r>
+        <w:t># Applied by the Ansible playbook inside the monitoring container:</w:t>
+      </w:r>
+    </w:p>
+    <w:p>
+      <w:pPr>
+        <w:pStyle w:val="ReportCode"/>
+      </w:pPr>
+      <w:r>
+        <w:t>puppet apply --modulepath=/etc/puppetlabs/code/modules \</w:t>
+      </w:r>
+    </w:p>
+    <w:p>
+      <w:pPr>
+        <w:pStyle w:val="ReportCode"/>
+      </w:pPr>
+      <w:r>
+        <w:t xml:space="preserve">  /etc/puppetlabs/code/modules/resume_analyzer_monitoring/manifests/init.pp</w:t>
+      </w:r>
+    </w:p>
+    <w:p>
+      <w:pPr>
+        <w:pStyle w:val="Heading1"/>
+      </w:pPr>
+      <w:r>
+        <w:t>6. Nagios Monitoring (10 marks)</w:t>
+      </w:r>
+    </w:p>
+    <w:p>
+      <w:pPr>
+        <w:pStyle w:val="Heading2"/>
+      </w:pPr>
+      <w:r>
+        <w:t>6.1 Check and thresholds</w:t>
+      </w:r>
+    </w:p>
+    <w:p>
+      <w:r>
+        <w:t>Nagios Core loads the Puppet-generated objects from /etc/nagios4/conf.d. check_http targets the app container’s private DNS name on port 5000. The expected status is 200. Response time is OK below warning threshold, WARNING above five seconds, and CRITICAL above ten seconds. Retry settings reduce transient noise; Nagios periodically evaluates the service and displays its state.</w:t>
+      </w:r>
+    </w:p>
+    <w:p>
+      <w:pPr>
+        <w:pStyle w:val="Heading2"/>
+      </w:pPr>
+      <w:r>
+        <w:t>6.2 UI and validation</w:t>
+      </w:r>
+    </w:p>
+    <w:p>
+      <w:r>
+        <w:t>The dashboard is published only on 127.0.0.1:8080/nagios4. Demo credentials are nagiosadmin / devops-demo and are unsuitable for public use. Ansible runs nagios4 -v /etc/nagios4/nagios.cfg before restarting services. After a successful apply and polling interval, capture the app host and health service in OK state; do not claim a screenshot until it exists.</w:t>
+      </w:r>
+    </w:p>
+    <w:p>
+      <w:pPr>
+        <w:pStyle w:val="Heading1"/>
+      </w:pPr>
+      <w:r>
+        <w:t>7. Integration and End-to-End Workflow (10 marks)</w:t>
+      </w:r>
+    </w:p>
+    <w:tbl>
+      <w:tblPr>
+        <w:tblStyle w:val="LightShading-Accent1"/>
+        <w:tblW w:type="auto" w:w="0"/>
+        <w:jc w:val="center"/>
+        <w:tblLook w:firstColumn="1" w:firstRow="1" w:lastColumn="0" w:lastRow="0" w:noHBand="0" w:noVBand="1" w:val="04A0"/>
+      </w:tblPr>
+      <w:tblGrid>
+        <w:gridCol w:w="3312"/>
+        <w:gridCol w:w="3312"/>
+        <w:gridCol w:w="3312"/>
+      </w:tblGrid>
+      <w:tr>
+        <w:tc>
+          <w:tcPr>
+            <w:tcW w:type="dxa" w:w="3312"/>
+          </w:tcPr>
+          <w:p>
+            <w:r>
+              <w:rPr>
+                <w:b/>
+              </w:rPr>
+              <w:t>Step</w:t>
+            </w:r>
+          </w:p>
+        </w:tc>
+        <w:tc>
+          <w:tcPr>
+            <w:tcW w:type="dxa" w:w="3312"/>
+          </w:tcPr>
+          <w:p>
+            <w:r>
+              <w:rPr>
+                <w:b/>
+              </w:rPr>
+              <w:t>Tool</w:t>
+            </w:r>
+          </w:p>
+        </w:tc>
+        <w:tc>
+          <w:tcPr>
+            <w:tcW w:type="dxa" w:w="3312"/>
+          </w:tcPr>
+          <w:p>
+            <w:r>
+              <w:rPr>
+                <w:b/>
+              </w:rPr>
+              <w:t>Action / result</w:t>
+            </w:r>
+          </w:p>
+        </w:tc>
+      </w:tr>
+      <w:tr>
+        <w:tc>
+          <w:tcPr>
+            <w:tcW w:type="dxa" w:w="3312"/>
+          </w:tcPr>
+          <w:p>
+            <w:r>
+              <w:t>1</w:t>
+            </w:r>
+          </w:p>
+        </w:tc>
+        <w:tc>
+          <w:tcPr>
+            <w:tcW w:type="dxa" w:w="3312"/>
+          </w:tcPr>
+          <w:p>
+            <w:r>
+              <w:t>Terraform</w:t>
+            </w:r>
+          </w:p>
+        </w:tc>
+        <w:tc>
+          <w:tcPr>
+            <w:tcW w:type="dxa" w:w="3312"/>
+          </w:tcPr>
+          <w:p>
+            <w:r>
+              <w:t>Build images and create the network and three containers.</w:t>
+            </w:r>
+          </w:p>
+        </w:tc>
+      </w:tr>
+      <w:tr>
+        <w:tc>
+          <w:tcPr>
+            <w:tcW w:type="dxa" w:w="3312"/>
+          </w:tcPr>
+          <w:p>
+            <w:r>
+              <w:t>2</w:t>
+            </w:r>
+          </w:p>
+        </w:tc>
+        <w:tc>
+          <w:tcPr>
+            <w:tcW w:type="dxa" w:w="3312"/>
+          </w:tcPr>
+          <w:p>
+            <w:r>
+              <w:t>Ansible</w:t>
+            </w:r>
+          </w:p>
+        </w:tc>
+        <w:tc>
+          <w:tcPr>
+            <w:tcW w:type="dxa" w:w="3312"/>
+          </w:tcPr>
+          <w:p>
+            <w:r>
+              <w:t>Terraform invokes the playbook in the controller container.</w:t>
+            </w:r>
+          </w:p>
+        </w:tc>
+      </w:tr>
+      <w:tr>
+        <w:tc>
+          <w:tcPr>
+            <w:tcW w:type="dxa" w:w="3312"/>
+          </w:tcPr>
+          <w:p>
+            <w:r>
+              <w:t>3</w:t>
+            </w:r>
+          </w:p>
+        </w:tc>
+        <w:tc>
+          <w:tcPr>
+            <w:tcW w:type="dxa" w:w="3312"/>
+          </w:tcPr>
+          <w:p>
+            <w:r>
+              <w:t>Puppet</w:t>
+            </w:r>
+          </w:p>
+        </w:tc>
+        <w:tc>
+          <w:tcPr>
+            <w:tcW w:type="dxa" w:w="3312"/>
+          </w:tcPr>
+          <w:p>
+            <w:r>
+              <w:t>Ansible applies the monitoring module through Docker connection.</w:t>
+            </w:r>
+          </w:p>
+        </w:tc>
+      </w:tr>
+      <w:tr>
+        <w:tc>
+          <w:tcPr>
+            <w:tcW w:type="dxa" w:w="3312"/>
+          </w:tcPr>
+          <w:p>
+            <w:r>
+              <w:t>4</w:t>
+            </w:r>
+          </w:p>
+        </w:tc>
+        <w:tc>
+          <w:tcPr>
+            <w:tcW w:type="dxa" w:w="3312"/>
+          </w:tcPr>
+          <w:p>
+            <w:r>
+              <w:t>Nagios</w:t>
+            </w:r>
+          </w:p>
+        </w:tc>
+        <w:tc>
+          <w:tcPr>
+            <w:tcW w:type="dxa" w:w="3312"/>
+          </w:tcPr>
+          <w:p>
+            <w:r>
+              <w:t>Puppet installs plugin, renders host/service config, and manages services.</w:t>
+            </w:r>
+          </w:p>
+        </w:tc>
+      </w:tr>
+      <w:tr>
+        <w:tc>
+          <w:tcPr>
+            <w:tcW w:type="dxa" w:w="3312"/>
+          </w:tcPr>
+          <w:p>
+            <w:r>
+              <w:t>5</w:t>
+            </w:r>
+          </w:p>
+        </w:tc>
+        <w:tc>
+          <w:tcPr>
+            <w:tcW w:type="dxa" w:w="3312"/>
+          </w:tcPr>
+          <w:p>
+            <w:r>
+              <w:t>Ansible</w:t>
+            </w:r>
+          </w:p>
+        </w:tc>
+        <w:tc>
+          <w:tcPr>
+            <w:tcW w:type="dxa" w:w="3312"/>
+          </w:tcPr>
+          <w:p>
+            <w:r>
+              <w:t>Validates Nagios, restarts services, and asserts app health.</w:t>
+            </w:r>
+          </w:p>
+        </w:tc>
+      </w:tr>
+      <w:tr>
+        <w:tc>
+          <w:tcPr>
+            <w:tcW w:type="dxa" w:w="3312"/>
+          </w:tcPr>
+          <w:p>
+            <w:r>
+              <w:t>6</w:t>
+            </w:r>
+          </w:p>
+        </w:tc>
+        <w:tc>
+          <w:tcPr>
+            <w:tcW w:type="dxa" w:w="3312"/>
+          </w:tcPr>
+          <w:p>
+            <w:r>
+              <w:t>Nagios</w:t>
+            </w:r>
+          </w:p>
+        </w:tc>
+        <w:tc>
+          <w:tcPr>
+            <w:tcW w:type="dxa" w:w="3312"/>
+          </w:tcPr>
+          <w:p>
+            <w:r>
+              <w:t>Continues recurring health checks; UI stays loopback-only.</w:t>
+            </w:r>
+          </w:p>
+        </w:tc>
+      </w:tr>
+      <w:tr>
+        <w:tc>
+          <w:tcPr>
+            <w:tcW w:type="dxa" w:w="3312"/>
+          </w:tcPr>
+          <w:p>
+            <w:r>
+              <w:t>7</w:t>
+            </w:r>
+          </w:p>
+        </w:tc>
+        <w:tc>
+          <w:tcPr>
+            <w:tcW w:type="dxa" w:w="3312"/>
+          </w:tcPr>
+          <w:p>
+            <w:r>
+              <w:t>Terraform</w:t>
+            </w:r>
+          </w:p>
+        </w:tc>
+        <w:tc>
+          <w:tcPr>
+            <w:tcW w:type="dxa" w:w="3312"/>
+          </w:tcPr>
+          <w:p>
+            <w:r>
+              <w:t>Destroy removes lab containers and network.</w:t>
+            </w:r>
+          </w:p>
+        </w:tc>
+      </w:tr>
+    </w:tbl>
+    <w:p/>
+    <w:p>
+      <w:r>
+        <w:t>This control flow directly demonstrates Terraform → Ansible → Puppet → Nagios, followed by an application smoke check. The GitHub Actions DevOps lab job is configured to validate and provision the lab on a Linux runner and destroy it afterward.</w:t>
+      </w:r>
+    </w:p>
+    <w:p>
+      <w:pPr>
+        <w:pStyle w:val="Heading1"/>
+      </w:pPr>
+      <w:r>
+        <w:t>8. Testing and Technical Evidence (5 marks)</w:t>
+      </w:r>
+    </w:p>
+    <w:p>
+      <w:pPr>
+        <w:pStyle w:val="Heading2"/>
+      </w:pPr>
+      <w:r>
+        <w:t>8.1 Application tests</w:t>
+      </w:r>
+    </w:p>
+    <w:p>
+      <w:r>
+        <w:t>The Python unittest suite covers the health endpoint and no-store header; visible result panels with skill comparison first; the current Groq model; title-only optimization producing a labeled draft; and detailed-description optimization preserving the no-invented-requirements instruction. Run: python -m unittest discover -s tests -v.</w:t>
+      </w:r>
+    </w:p>
+    <w:p>
+      <w:pPr>
+        <w:pStyle w:val="Heading2"/>
+      </w:pPr>
+      <w:r>
+        <w:t>8.2 Infrastructure validation and honest status</w:t>
+      </w:r>
+    </w:p>
+    <w:p>
+      <w:r>
+        <w:t>The five application tests passed. Terraform provider initialization and terraform validate passed with kreuzwerker/docker 3.9.0. A live local apply was attempted but could not reach Docker Desktop: its status remained starting, the docker-desktop WSL distribution was stopped, and Docker API calls returned HTTP 500. Therefore no successful local Ansible/Puppet execution, Nagios state, or live dashboard has been verified in this session. The GitHub Actions integration job is configured but its result must be checked before claiming end-to-end success.</w:t>
+      </w:r>
+    </w:p>
+    <w:p>
+      <w:pPr>
+        <w:pStyle w:val="Heading2"/>
+      </w:pPr>
+      <w:r>
+        <w:t>8.3 Evidence to capture</w:t>
+      </w:r>
+    </w:p>
+    <w:p>
+      <w:pPr>
+        <w:pStyle w:val="ListBullet"/>
+      </w:pPr>
+      <w:r>
+        <w:t>Terraform apply completion with app_url and nagios_url outputs.</w:t>
+      </w:r>
+    </w:p>
+    <w:p>
+      <w:pPr>
+        <w:pStyle w:val="ListBullet"/>
+      </w:pPr>
+      <w:r>
+        <w:t>Ansible recap showing Puppet, Nagios validation, and health assertion successful.</w:t>
+      </w:r>
+    </w:p>
+    <w:p>
+      <w:pPr>
+        <w:pStyle w:val="ListBullet"/>
+      </w:pPr>
+      <w:r>
+        <w:t>Nagios dashboard showing resume-analyzer-app / Flask health endpoint in OK state.</w:t>
+      </w:r>
+    </w:p>
+    <w:p>
+      <w:pPr>
+        <w:pStyle w:val="ListBullet"/>
+      </w:pPr>
+      <w:r>
+        <w:t>Successful GitHub Actions devops-lab job and cleanup.</w:t>
+      </w:r>
+    </w:p>
+    <w:p>
+      <w:pPr>
+        <w:pStyle w:val="ListBullet"/>
+      </w:pPr>
+      <w:r>
+        <w:t>Application screenshot showing matched and missing skills.</w:t>
+      </w:r>
+    </w:p>
+    <w:p>
+      <w:r>
+        <w:t>Use screenshots from actual successful runs only; do not substitute mock output.</w:t>
+      </w:r>
+    </w:p>
+    <w:p>
+      <w:pPr>
+        <w:pStyle w:val="Heading1"/>
+      </w:pPr>
+      <w:r>
+        <w:t>9. Security, Operations, and Limitations</w:t>
+      </w:r>
+    </w:p>
+    <w:p>
+      <w:pPr>
+        <w:pStyle w:val="ListBullet"/>
+      </w:pPr>
+      <w:r>
+        <w:t>Mounting /var/run/docker.sock grants broad, effectively root-level control of the Docker host. Use a disposable trusted machine; never expose the controller publicly.</w:t>
+      </w:r>
+    </w:p>
+    <w:p>
+      <w:pPr>
+        <w:pStyle w:val="ListBullet"/>
+      </w:pPr>
+      <w:r>
+        <w:t>App and dashboard ports bind to 127.0.0.1. Demo Nagios credentials are local-only and must change before non-local use.</w:t>
+      </w:r>
+    </w:p>
+    <w:p>
+      <w:pPr>
+        <w:pStyle w:val="ListBullet"/>
+      </w:pPr>
+      <w:r>
+        <w:t>Terraform state is local and ignored by Git; do not commit it or secrets.</w:t>
+      </w:r>
+    </w:p>
+    <w:p>
+      <w:pPr>
+        <w:pStyle w:val="ListBullet"/>
+      </w:pPr>
+      <w:r>
+        <w:t>Render is managed separately; this project does not claim host access there.</w:t>
+      </w:r>
+    </w:p>
+    <w:p>
+      <w:pPr>
+        <w:pStyle w:val="ListBullet"/>
+      </w:pPr>
+      <w:r>
+        <w:t>Identifier redaction is incomplete. AI scores and suggestions can be inaccurate and require human review.</w:t>
+      </w:r>
+    </w:p>
+    <w:p>
+      <w:pPr>
+        <w:pStyle w:val="ListBullet"/>
+      </w:pPr>
+      <w:r>
+        <w:t>Scanned PDFs need OCR, which is not implemented.</w:t>
+      </w:r>
+    </w:p>
+    <w:p>
+      <w:pPr>
+        <w:pStyle w:val="Heading1"/>
+      </w:pPr>
+      <w:r>
+        <w:t>10. Installation and Demonstration</w:t>
+      </w:r>
+    </w:p>
+    <w:p>
+      <w:pPr>
+        <w:pStyle w:val="Heading2"/>
+      </w:pPr>
+      <w:r>
+        <w:t>10.1 Prerequisites</w:t>
+      </w:r>
+    </w:p>
+    <w:p>
+      <w:pPr>
+        <w:pStyle w:val="ListBullet"/>
+      </w:pPr>
+      <w:r>
+        <w:t>Docker Desktop running Linux containers with engine API available.</w:t>
+      </w:r>
+    </w:p>
+    <w:p>
+      <w:pPr>
+        <w:pStyle w:val="ListBullet"/>
+      </w:pPr>
+      <w:r>
+        <w:t>Terraform &gt;= 1.5, Docker CLI, internet to pull images/install packages.</w:t>
+      </w:r>
+    </w:p>
+    <w:p>
+      <w:pPr>
+        <w:pStyle w:val="ListBullet"/>
+      </w:pPr>
+      <w:r>
+        <w:t>No cloud account for the local lab; Groq API key only for real AI analysis.</w:t>
+      </w:r>
+    </w:p>
+    <w:p>
+      <w:pPr>
+        <w:pStyle w:val="Heading2"/>
+      </w:pPr>
+      <w:r>
+        <w:t>10.2 Local run</w:t>
+      </w:r>
+    </w:p>
+    <w:p>
+      <w:pPr>
+        <w:pStyle w:val="ReportCode"/>
+      </w:pPr>
+      <w:r>
+        <w:t>$env:DOCKER_HOST = 'npipe:////./pipe/dockerDesktopLinuxEngine'</w:t>
+      </w:r>
+    </w:p>
+    <w:p>
+      <w:pPr>
+        <w:pStyle w:val="ReportCode"/>
+      </w:pPr>
+      <w:r>
+        <w:t>docker info</w:t>
+      </w:r>
+    </w:p>
+    <w:p>
+      <w:pPr>
+        <w:pStyle w:val="ReportCode"/>
+      </w:pPr>
+      <w:r>
+        <w:t>terraform -chdir=terraform init</w:t>
+      </w:r>
+    </w:p>
+    <w:p>
+      <w:pPr>
+        <w:pStyle w:val="ReportCode"/>
+      </w:pPr>
+      <w:r>
+        <w:t>terraform -chdir=terraform fmt -check</w:t>
+      </w:r>
+    </w:p>
+    <w:p>
+      <w:pPr>
+        <w:pStyle w:val="ReportCode"/>
+      </w:pPr>
+      <w:r>
+        <w:t>terraform -chdir=terraform validate</w:t>
+      </w:r>
+    </w:p>
+    <w:p>
+      <w:pPr>
+        <w:pStyle w:val="ReportCode"/>
+      </w:pPr>
+      <w:r>
+        <w:t>terraform -chdir=terraform apply</w:t>
+      </w:r>
+    </w:p>
+    <w:p>
+      <w:pPr>
+        <w:pStyle w:val="ReportCode"/>
+      </w:pPr>
+      <w:r>
+        <w:t>terraform -chdir=terraform output</w:t>
+      </w:r>
+    </w:p>
+    <w:p>
+      <w:pPr>
+        <w:pStyle w:val="ReportCode"/>
+      </w:pPr>
+      <w:r>
+        <w:t>Invoke-RestMethod http://127.0.0.1:5000/health</w:t>
+      </w:r>
+    </w:p>
+    <w:p>
+      <w:pPr>
+        <w:pStyle w:val="ReportCode"/>
+      </w:pPr>
+      <w:r>
+        <w:t># Open http://127.0.0.1:8080/nagios4/ in a browser</w:t>
+      </w:r>
+    </w:p>
+    <w:p>
+      <w:pPr>
+        <w:pStyle w:val="ReportCode"/>
+      </w:pPr>
+      <w:r>
+        <w:t>terraform -chdir=terraform destroy</w:t>
+      </w:r>
+    </w:p>
+    <w:p>
+      <w:r>
+        <w:t>Configure GROQ_API_KEY in Render or a private local .env file. GitHub Actions image publishing separately requires DOCKER_USERNAME and DOCKER_TOKEN. Never include secret values in screenshots.</w:t>
+      </w:r>
+    </w:p>
+    <w:p>
+      <w:pPr>
+        <w:pStyle w:val="Heading1"/>
+      </w:pPr>
+      <w:r>
+        <w:t>11. Conclusion</w:t>
+      </w:r>
+    </w:p>
+    <w:p>
+      <w:r>
+        <w:t>This project combines an AI-assisted resume review application with a coherent DevOps lab: Terraform-managed Docker resources, Ansible orchestration, a Puppet module with package/file/service resources, and a Nagios HTTP service check. The boundary between the local lab and Render avoids unsupported host-access claims. The remaining practical requirement is to run the lab against a healthy Docker Engine, capture genuine integration evidence, and complete the cover placeholders.</w:t>
+      </w:r>
+    </w:p>
+    <w:p>
+      <w:pPr>
+        <w:pStyle w:val="Heading1"/>
+      </w:pPr>
+      <w:r>
+        <w:t>Appendix A. Rubric-to-Evidence Mapping</w:t>
+      </w:r>
+    </w:p>
+    <w:tbl>
+      <w:tblPr>
+        <w:tblStyle w:val="LightShading-Accent1"/>
+        <w:tblW w:type="auto" w:w="0"/>
+        <w:jc w:val="center"/>
+        <w:tblLook w:firstColumn="1" w:firstRow="1" w:lastColumn="0" w:lastRow="0" w:noHBand="0" w:noVBand="1" w:val="04A0"/>
+      </w:tblPr>
+      <w:tblGrid>
+        <w:gridCol w:w="3312"/>
+        <w:gridCol w:w="3312"/>
+        <w:gridCol w:w="3312"/>
+      </w:tblGrid>
+      <w:tr>
+        <w:tc>
+          <w:tcPr>
+            <w:tcW w:type="dxa" w:w="3312"/>
+          </w:tcPr>
+          <w:p>
+            <w:r>
+              <w:rPr>
+                <w:b/>
+              </w:rPr>
+              <w:t>Evaluation criterion</w:t>
+            </w:r>
+          </w:p>
+        </w:tc>
+        <w:tc>
+          <w:tcPr>
+            <w:tcW w:type="dxa" w:w="3312"/>
+          </w:tcPr>
+          <w:p>
+            <w:r>
+              <w:rPr>
+                <w:b/>
+              </w:rPr>
+              <w:t>Marks</w:t>
+            </w:r>
+          </w:p>
+        </w:tc>
+        <w:tc>
+          <w:tcPr>
+            <w:tcW w:type="dxa" w:w="3312"/>
+          </w:tcPr>
+          <w:p>
+            <w:r>
+              <w:rPr>
+                <w:b/>
+              </w:rPr>
+              <w:t>Implementation / evidence</w:t>
+            </w:r>
+          </w:p>
+        </w:tc>
+      </w:tr>
+      <w:tr>
+        <w:tc>
+          <w:tcPr>
+            <w:tcW w:type="dxa" w:w="3312"/>
+          </w:tcPr>
+          <w:p>
+            <w:r>
+              <w:t>Problem selection, innovation &amp; relevance</w:t>
+            </w:r>
+          </w:p>
+        </w:tc>
+        <w:tc>
+          <w:tcPr>
+            <w:tcW w:type="dxa" w:w="3312"/>
+          </w:tcPr>
+          <w:p>
+            <w:r>
+              <w:t>10</w:t>
+            </w:r>
+          </w:p>
+        </w:tc>
+        <w:tc>
+          <w:tcPr>
+            <w:tcW w:type="dxa" w:w="3312"/>
+          </w:tcPr>
+          <w:p>
+            <w:r>
+              <w:t>Resume-to-role matching is a relevant automation problem; scope and limits are explicit.</w:t>
+            </w:r>
+          </w:p>
+        </w:tc>
+      </w:tr>
+      <w:tr>
+        <w:tc>
+          <w:tcPr>
+            <w:tcW w:type="dxa" w:w="3312"/>
+          </w:tcPr>
+          <w:p>
+            <w:r>
+              <w:t>Architecture &amp; configuration-management design</w:t>
+            </w:r>
+          </w:p>
+        </w:tc>
+        <w:tc>
+          <w:tcPr>
+            <w:tcW w:type="dxa" w:w="3312"/>
+          </w:tcPr>
+          <w:p>
+            <w:r>
+              <w:t>10</w:t>
+            </w:r>
+          </w:p>
+        </w:tc>
+        <w:tc>
+          <w:tcPr>
+            <w:tcW w:type="dxa" w:w="3312"/>
+          </w:tcPr>
+          <w:p>
+            <w:r>
+              <w:t>Docker lab integrates Terraform, Ansible, Puppet, and Nagios; Render remains separate.</w:t>
+            </w:r>
+          </w:p>
+        </w:tc>
+      </w:tr>
+      <w:tr>
+        <w:tc>
+          <w:tcPr>
+            <w:tcW w:type="dxa" w:w="3312"/>
+          </w:tcPr>
+          <w:p>
+            <w:r>
+              <w:t>Puppet implementation &amp; configuration automation</w:t>
+            </w:r>
+          </w:p>
+        </w:tc>
+        <w:tc>
+          <w:tcPr>
+            <w:tcW w:type="dxa" w:w="3312"/>
+          </w:tcPr>
+          <w:p>
+            <w:r>
+              <w:t>15</w:t>
+            </w:r>
+          </w:p>
+        </w:tc>
+        <w:tc>
+          <w:tcPr>
+            <w:tcW w:type="dxa" w:w="3312"/>
+          </w:tcPr>
+          <w:p>
+            <w:r>
+              <w:t>Package, template-backed file, and service resources manage real Nagios configuration.</w:t>
+            </w:r>
+          </w:p>
+        </w:tc>
+      </w:tr>
+      <w:tr>
+        <w:tc>
+          <w:tcPr>
+            <w:tcW w:type="dxa" w:w="3312"/>
+          </w:tcPr>
+          <w:p>
+            <w:r>
+              <w:t>Nagios monitoring implementation</w:t>
+            </w:r>
+          </w:p>
+        </w:tc>
+        <w:tc>
+          <w:tcPr>
+            <w:tcW w:type="dxa" w:w="3312"/>
+          </w:tcPr>
+          <w:p>
+            <w:r>
+              <w:t>10</w:t>
+            </w:r>
+          </w:p>
+        </w:tc>
+        <w:tc>
+          <w:tcPr>
+            <w:tcW w:type="dxa" w:w="3312"/>
+          </w:tcPr>
+          <w:p>
+            <w:r>
+              <w:t>HTTP health command, host/service objects, thresholds, validation, and local UI.</w:t>
+            </w:r>
+          </w:p>
+        </w:tc>
+      </w:tr>
+      <w:tr>
+        <w:tc>
+          <w:tcPr>
+            <w:tcW w:type="dxa" w:w="3312"/>
+          </w:tcPr>
+          <w:p>
+            <w:r>
+              <w:t>Terraform Infrastructure as Code</w:t>
+            </w:r>
+          </w:p>
+        </w:tc>
+        <w:tc>
+          <w:tcPr>
+            <w:tcW w:type="dxa" w:w="3312"/>
+          </w:tcPr>
+          <w:p>
+            <w:r>
+              <w:t>15</w:t>
+            </w:r>
+          </w:p>
+        </w:tc>
+        <w:tc>
+          <w:tcPr>
+            <w:tcW w:type="dxa" w:w="3312"/>
+          </w:tcPr>
+          <w:p>
+            <w:r>
+              <w:t>Pinned provider, image/network/container resources, outputs, dependencies, and teardown.</w:t>
+            </w:r>
+          </w:p>
+        </w:tc>
+      </w:tr>
+      <w:tr>
+        <w:tc>
+          <w:tcPr>
+            <w:tcW w:type="dxa" w:w="3312"/>
+          </w:tcPr>
+          <w:p>
+            <w:r>
+              <w:t>Ansible automation &amp; playbooks</w:t>
+            </w:r>
+          </w:p>
+        </w:tc>
+        <w:tc>
+          <w:tcPr>
+            <w:tcW w:type="dxa" w:w="3312"/>
+          </w:tcPr>
+          <w:p>
+            <w:r>
+              <w:t>15</w:t>
+            </w:r>
+          </w:p>
+        </w:tc>
+        <w:tc>
+          <w:tcPr>
+            <w:tcW w:type="dxa" w:w="3312"/>
+          </w:tcPr>
+          <w:p>
+            <w:r>
+              <w:t>Docker inventory/connection, Puppet apply, Nagios checks, and health assertion.</w:t>
+            </w:r>
+          </w:p>
+        </w:tc>
+      </w:tr>
+      <w:tr>
+        <w:tc>
+          <w:tcPr>
+            <w:tcW w:type="dxa" w:w="3312"/>
+          </w:tcPr>
+          <w:p>
+            <w:r>
+              <w:t>Tool integration / end-to-end automation</w:t>
+            </w:r>
+          </w:p>
+        </w:tc>
+        <w:tc>
+          <w:tcPr>
+            <w:tcW w:type="dxa" w:w="3312"/>
+          </w:tcPr>
+          <w:p>
+            <w:r>
+              <w:t>10</w:t>
+            </w:r>
+          </w:p>
+        </w:tc>
+        <w:tc>
+          <w:tcPr>
+            <w:tcW w:type="dxa" w:w="3312"/>
+          </w:tcPr>
+          <w:p>
+            <w:r>
+              <w:t>Terraform invokes Ansible; Ansible applies Puppet and validates Nagios and the app.</w:t>
+            </w:r>
+          </w:p>
+        </w:tc>
+      </w:tr>
+      <w:tr>
+        <w:tc>
+          <w:tcPr>
+            <w:tcW w:type="dxa" w:w="3312"/>
+          </w:tcPr>
+          <w:p>
+            <w:r>
+              <w:t>Testing, validation &amp; technical evidence</w:t>
+            </w:r>
+          </w:p>
+        </w:tc>
+        <w:tc>
+          <w:tcPr>
+            <w:tcW w:type="dxa" w:w="3312"/>
+          </w:tcPr>
+          <w:p>
+            <w:r>
+              <w:t>5</w:t>
+            </w:r>
+          </w:p>
+        </w:tc>
+        <w:tc>
+          <w:tcPr>
+            <w:tcW w:type="dxa" w:w="3312"/>
+          </w:tcPr>
+          <w:p>
+            <w:r>
+              <w:t>Five app tests and Terraform validation passed; live lab evidence is still required.</w:t>
+            </w:r>
+          </w:p>
+        </w:tc>
+      </w:tr>
+      <w:tr>
+        <w:tc>
+          <w:tcPr>
+            <w:tcW w:type="dxa" w:w="3312"/>
+          </w:tcPr>
+          <w:p>
+            <w:r>
+              <w:t>Project report &amp; documentation</w:t>
+            </w:r>
+          </w:p>
+        </w:tc>
+        <w:tc>
+          <w:tcPr>
+            <w:tcW w:type="dxa" w:w="3312"/>
+          </w:tcPr>
+          <w:p>
+            <w:r>
+              <w:t>5</w:t>
+            </w:r>
+          </w:p>
+        </w:tc>
+        <w:tc>
+          <w:tcPr>
+            <w:tcW w:type="dxa" w:w="3312"/>
+          </w:tcPr>
+          <w:p>
+            <w:r>
+              <w:t>This report maps implementation to the rubric and gives reproducible commands.</w:t>
+            </w:r>
+          </w:p>
+        </w:tc>
+      </w:tr>
+      <w:tr>
+        <w:tc>
+          <w:tcPr>
+            <w:tcW w:type="dxa" w:w="3312"/>
+          </w:tcPr>
+          <w:p>
+            <w:r>
+              <w:t>Viva &amp; live demonstration</w:t>
+            </w:r>
+          </w:p>
+        </w:tc>
+        <w:tc>
+          <w:tcPr>
+            <w:tcW w:type="dxa" w:w="3312"/>
+          </w:tcPr>
+          <w:p>
+            <w:r>
+              <w:t>5</w:t>
+            </w:r>
+          </w:p>
+        </w:tc>
+        <w:tc>
+          <w:tcPr>
+            <w:tcW w:type="dxa" w:w="3312"/>
+          </w:tcPr>
+          <w:p>
+            <w:r>
+              <w:t>Appendix includes a demo sequence and design-question prompts.</w:t>
+            </w:r>
+          </w:p>
+        </w:tc>
+      </w:tr>
+    </w:tbl>
+    <w:p/>
+    <w:p>
+      <w:pPr>
+        <w:pStyle w:val="Heading1"/>
+      </w:pPr>
+      <w:r>
+        <w:t>Appendix B. Viva and Demonstration Questions</w:t>
+      </w:r>
+    </w:p>
+    <w:p>
+      <w:pPr>
+        <w:pStyle w:val="ListBullet"/>
+      </w:pPr>
+      <w:r>
+        <w:t>Why separate Render and the local lab? Render abstracts away the host; the lab supplies disposable controllable containers.</w:t>
+      </w:r>
+    </w:p>
+    <w:p>
+      <w:pPr>
+        <w:pStyle w:val="ListBullet"/>
+      </w:pPr>
+      <w:r>
+        <w:t>What does Terraform own? Images, isolated network, three containers, and dependency-triggered Ansible execution.</w:t>
+      </w:r>
+    </w:p>
+    <w:p>
+      <w:pPr>
+        <w:pStyle w:val="ListBullet"/>
+      </w:pPr>
+      <w:r>
+        <w:t>What does Puppet own? Nagios plugin package, host/service object file, and monitoring service state.</w:t>
+      </w:r>
+    </w:p>
+    <w:p>
+      <w:pPr>
+        <w:pStyle w:val="ListBullet"/>
+      </w:pPr>
+      <w:r>
+        <w:t>Why use Ansible? Inventory, target connections, repeatable orchestration, retries, and assertions.</w:t>
+      </w:r>
+    </w:p>
+    <w:p>
+      <w:pPr>
+        <w:pStyle w:val="ListBullet"/>
+      </w:pPr>
+      <w:r>
+        <w:t>How is integration proven? Apply invokes Ansible; Ansible applies Puppet and validates Nagios and the app.</w:t>
+      </w:r>
+    </w:p>
+    <w:p>
+      <w:pPr>
+        <w:pStyle w:val="ListBullet"/>
+      </w:pPr>
+      <w:r>
+        <w:t>What does /health prove? Process readiness only, not Groq API validity or end-to-end analysis.</w:t>
+      </w:r>
+    </w:p>
+    <w:p>
+      <w:pPr>
+        <w:pStyle w:val="ListBullet"/>
+      </w:pPr>
+      <w:r>
+        <w:t>What are the risks? Docker socket control, demo credentials, inaccurate AI output, and incomplete redaction.</w:t>
+      </w:r>
+    </w:p>
+    <w:p>
+      <w:pPr>
+        <w:pStyle w:val="Heading1"/>
       </w:pPr>
       <w:r>
         <w:t>References</w:t>
       </w:r>
     </w:p>
     <w:p>
+      <w:pPr>
+        <w:pStyle w:val="ListBullet"/>
+      </w:pPr>
       <w:r>
-        <w:br w:type="page"/>
+        <w:t>Terraform Docker provider: https://registry.terraform.io/providers/kreuzwerker/docker/latest/docs</w:t>
       </w:r>
     </w:p>
     <w:p>
       <w:pPr>
-        <w:pStyle w:val="Heading1"/>
+        <w:pStyle w:val="ListBullet"/>
       </w:pPr>
       <w:r>
-        <w:t>1. Introduction</w:t>
+        <w:t>Terraform language: https://developer.hashicorp.com/terraform/language</w:t>
       </w:r>
     </w:p>
     <w:p>
       <w:pPr>
-        <w:pStyle w:val="Heading2"/>
+        <w:pStyle w:val="ListBullet"/>
       </w:pPr>
       <w:r>
-        <w:t>Project overview</w:t>
+        <w:t>Ansible Docker connection: https://docs.ansible.com/ansible/latest/collections/community/docker/docker_connection.html</w:t>
       </w:r>
     </w:p>
     <w:p>
+      <w:pPr>
+        <w:pStyle w:val="ListBullet"/>
+      </w:pPr>
       <w:r>
-        <w:t>Careerly AI Resume Analyzer is a web application that compares a resume with a target job description. It extracts text from a PDF resume and asks a hosted large language model to return a structured review for the applicant.</w:t>
+        <w:t>Ansible URI module: https://docs.ansible.com/ansible/latest/collections/ansible/builtin/uri_module.html</w:t>
       </w:r>
     </w:p>
     <w:p>
       <w:pPr>
-        <w:pStyle w:val="Heading2"/>
+        <w:pStyle w:val="ListBullet"/>
       </w:pPr>
       <w:r>
-        <w:t>Problem statement</w:t>
+        <w:t>Puppet resources: https://help.puppet.com/core/current/Content/PuppetCore/lang_resources.htm</w:t>
       </w:r>
     </w:p>
     <w:p>
+      <w:pPr>
+        <w:pStyle w:val="ListBullet"/>
+      </w:pPr>
       <w:r>
-        <w:t>Applicants often have limited feedback about how their resumes align with a particular vacancy. Manually comparing skills and tailoring a resume can be time-consuming. The project provides a repeatable, role-specific review to help users identify alignment and possible gaps.</w:t>
+        <w:t>Nagios Core documentation: https://assets.nagios.com/downloads/nagioscore/docs/nagioscore/4/en/</w:t>
       </w:r>
     </w:p>
     <w:p>
       <w:pPr>
-        <w:pStyle w:val="Heading2"/>
+        <w:pStyle w:val="ListBullet"/>
       </w:pPr>
       <w:r>
-        <w:t>Objectives</w:t>
+        <w:t>Nagios check_http: https://nagios-plugins.org/doc/man/check_http.html</w:t>
       </w:r>
     </w:p>
     <w:p>
-      <w:r>
-        <w:t>The objectives are to accept PDF resumes securely, compare extracted resume text with job requirements, present an ATS-style score and skill comparison, provide actionable feedback, and demonstrate containerization, CI/CD, cloud deployment configuration, and basic operations tooling.</w:t>
-      </w:r>
-    </w:p>
-    <w:p>
-      <w:pPr>
-        <w:pStyle w:val="Heading2"/>
-      </w:pPr>
-      <w:r>
-        <w:t>Scope</w:t>
-      </w:r>
-    </w:p>
-    <w:p>
-      <w:r>
-        <w:t>The system is an advisory resume-review application. It does not submit applications, modify a user resume, guarantee a real ATS score, or replace a recruiter. Resume files are not retained by the application.</w:t>
-      </w:r>
-    </w:p>
-    <w:p>
-      <w:pPr>
-        <w:pStyle w:val="Heading1"/>
-      </w:pPr>
-      <w:r>
-        <w:t>2. Requirements and Technology Stack</w:t>
-      </w:r>
-    </w:p>
-    <w:p>
-      <w:pPr>
-        <w:pStyle w:val="Heading2"/>
-      </w:pPr>
-      <w:r>
-        <w:t>Functional requirements</w:t>
-      </w:r>
-    </w:p>
-    <w:p>
-      <w:r>
-        <w:t>The user can upload a PDF (maximum 16 MB), enter or optimize job-description text, explicitly consent to sending text to the AI provider, and review the returned score, matching skills, skills to develop, strengths, weaknesses, and suggestions.</w:t>
-      </w:r>
-    </w:p>
-    <w:p>
-      <w:pPr>
-        <w:pStyle w:val="Heading2"/>
-      </w:pPr>
-      <w:r>
-        <w:t>Software stack</w:t>
-      </w:r>
-    </w:p>
-    <w:p>
-      <w:r>
-        <w:t>Backend: Python and Flask. Frontend: server-rendered HTML, CSS, and vanilla JavaScript. PDF text extraction: PyPDF2. AI inference: Groq API using openai/gpt-oss-120b by default. Configuration: python-dotenv. Delivery: Docker, GitHub Actions, and Render.</w:t>
-      </w:r>
-    </w:p>
-    <w:p>
-      <w:pPr>
-        <w:pStyle w:val="Heading2"/>
-      </w:pPr>
-      <w:r>
-        <w:t>Runtime versions</w:t>
-      </w:r>
-    </w:p>
-    <w:p>
-      <w:r>
-        <w:t>The CI test job runs on Python 3.11. The Docker image uses python:3.13-slim. The README documents Python 3.11 or newer for local setup.</w:t>
-      </w:r>
-    </w:p>
-    <w:p>
-      <w:pPr>
-        <w:pStyle w:val="Heading2"/>
-      </w:pPr>
-      <w:r>
-        <w:t>Operational prerequisites</w:t>
-      </w:r>
-    </w:p>
-    <w:p>
-      <w:r>
-        <w:t>A Groq API key is required for analysis and optimization. Docker Hub username and access-token secrets are required for image publishing from pushes to main. Render requires GROQ_API_KEY as a service environment variable.</w:t>
-      </w:r>
-    </w:p>
-    <w:p>
-      <w:pPr>
-        <w:pStyle w:val="Heading1"/>
-      </w:pPr>
-      <w:r>
-        <w:t>3. System Architecture and Workflow</w:t>
-      </w:r>
-    </w:p>
-    <w:p>
-      <w:pPr>
-        <w:pStyle w:val="Heading2"/>
-      </w:pPr>
-      <w:r>
-        <w:t>Architecture</w:t>
-      </w:r>
-    </w:p>
-    <w:p>
-      <w:r>
-        <w:t>The browser communicates with a Flask application. Flask validates the request, extracts PDF text in memory, redacts common direct identifiers, and sends the remaining resume and job-description text to Groq after user consent. Groq returns structured analysis, which Flask serves as JSON and the browser renders.</w:t>
-      </w:r>
-    </w:p>
-    <w:p>
-      <w:pPr>
-        <w:pStyle w:val="Heading2"/>
-      </w:pPr>
-      <w:r>
-        <w:t>Request flow</w:t>
-      </w:r>
-    </w:p>
-    <w:p>
-      <w:r>
-        <w:t>1) Select a PDF and enter a job description or role title. 2) Confirm the AI-processing disclosure. 3) Flask validates the upload and extracts text. 4) The application redacts common email, phone, street-address, and link patterns. 5) The Groq chat-completions API evaluates the prompt. 6) The browser displays the response.</w:t>
-      </w:r>
-    </w:p>
-    <w:p>
-      <w:pPr>
-        <w:pStyle w:val="Heading2"/>
-      </w:pPr>
-      <w:r>
-        <w:t>Application endpoints</w:t>
-      </w:r>
-    </w:p>
-    <w:p>
-      <w:r>
-        <w:t>GET / serves the user interface. GET /health returns process status and whether an AI key is configured. POST /optimize structures detailed job text or creates a clearly labeled general starter draft when input looks like a short role title. POST /analyze accepts the PDF, job description, and consent and returns the structured review.</w:t>
-      </w:r>
-    </w:p>
-    <w:p>
-      <w:pPr>
-        <w:pStyle w:val="Heading2"/>
-      </w:pPr>
-      <w:r>
-        <w:t>Analysis output</w:t>
-      </w:r>
-    </w:p>
-    <w:p>
-      <w:r>
-        <w:t>The report contains an ATS-style score (0-100), matching skills, missing or underrepresented skills, strengths, weaknesses, suggestions, and an overall summary. Results are presented together, with the skills comparison first so applicants can see the match and gaps immediately.</w:t>
-      </w:r>
-    </w:p>
-    <w:p>
-      <w:pPr>
-        <w:pStyle w:val="Heading1"/>
-      </w:pPr>
-      <w:r>
-        <w:t>4. Application Implementation</w:t>
-      </w:r>
-    </w:p>
-    <w:p>
-      <w:pPr>
-        <w:pStyle w:val="Heading2"/>
-      </w:pPr>
-      <w:r>
-        <w:t>Resume processing</w:t>
-      </w:r>
-    </w:p>
-    <w:p>
-      <w:r>
-        <w:t>The Flask request class uses an in-memory stream for uploaded files. The server checks that a file is present, has a PDF extension, is within the configured request-size limit, and contains extractable text. Scanned-image PDFs without a text layer are not OCR-processed and return an explanatory error.</w:t>
-      </w:r>
-    </w:p>
-    <w:p>
-      <w:pPr>
-        <w:pStyle w:val="Heading2"/>
-      </w:pPr>
-      <w:r>
-        <w:t>AI integration</w:t>
-      </w:r>
-    </w:p>
-    <w:p>
-      <w:r>
-        <w:t>The application calls Groq chat completions with a configurable GROQ_MODEL. The current default is openai/gpt-oss-120b. Resume analysis requests JSON with a defined output shape; invalid JSON is logged and returned as an application error rather than silently accepted.</w:t>
-      </w:r>
-    </w:p>
-    <w:p>
-      <w:pPr>
-        <w:pStyle w:val="Heading2"/>
-      </w:pPr>
-      <w:r>
-        <w:t>Job-description optimization</w:t>
-      </w:r>
-    </w:p>
-    <w:p>
-      <w:r>
-        <w:t>Detailed descriptions are reorganized into Role Summary, Required Skills, Nice-to-Have Skills, Responsibilities, and Qualifications while the prompt instructs the model to preserve supplied requirements. Short, single-line role-title input instead requests a general starter draft and the interface labels it as AI-generated for review. Users should tailor such a draft to the actual employer posting.</w:t>
-      </w:r>
-    </w:p>
-    <w:p>
-      <w:pPr>
-        <w:pStyle w:val="Heading2"/>
-      </w:pPr>
-      <w:r>
-        <w:t>User interface</w:t>
-      </w:r>
-    </w:p>
-    <w:p>
-      <w:r>
-        <w:t>The responsive interface includes PDF upload, file replacement/removal, job-description editing, consent, optimization, progress and error states, and a report. Results show the matched and missing-skill groups first, followed by score and summary, strengths and improvement areas, and suggested next steps.</w:t>
-      </w:r>
-    </w:p>
-    <w:p>
-      <w:pPr>
-        <w:pStyle w:val="Heading1"/>
-      </w:pPr>
-      <w:r>
-        <w:t>5. DevOps, CI/CD, and Deployment</w:t>
-      </w:r>
-    </w:p>
-    <w:p>
-      <w:pPr>
-        <w:pStyle w:val="Heading2"/>
-      </w:pPr>
-      <w:r>
-        <w:t>Docker</w:t>
-      </w:r>
-    </w:p>
-    <w:p>
-      <w:r>
-        <w:t>The Dockerfile starts from python:3.13-slim, installs Python dependencies, copies the application, binds the Flask process to 0.0.0.0 in the container, and runs app.py. The Docker image does not embed the Groq API key; secrets are provided at runtime.</w:t>
-      </w:r>
-    </w:p>
-    <w:p>
-      <w:pPr>
-        <w:pStyle w:val="Heading2"/>
-      </w:pPr>
-      <w:r>
-        <w:t>GitHub Actions</w:t>
-      </w:r>
-    </w:p>
-    <w:p>
-      <w:r>
-        <w:t>The workflow runs unit tests for pushes to main and pull requests targeting main. Pull requests also build a Docker image without publishing it. A main-branch push requires DOCKER_USERNAME and DOCKER_TOKEN, logs in to Docker Hub, then publishes latest and a commit-SHA tag to abhijeetchy51/ai-resume-analyser. Missing publishing secrets fail the job explicitly.</w:t>
-      </w:r>
-    </w:p>
-    <w:p>
-      <w:pPr>
-        <w:pStyle w:val="Heading2"/>
-      </w:pPr>
-      <w:r>
-        <w:t>Render deployment</w:t>
-      </w:r>
-    </w:p>
-    <w:p>
-      <w:r>
-        <w:t>render.yaml defines a Docker web service built from the repository Dockerfile, declares /health as the health-check endpoint, and requires GROQ_API_KEY to be supplied outside source control. The Render Blueprint builds from the repository configuration; the workflow separately publishes images to Docker Hub.</w:t>
-      </w:r>
-    </w:p>
-    <w:p>
-      <w:pPr>
-        <w:pStyle w:val="Heading2"/>
-      </w:pPr>
-      <w:r>
-        <w:t>Configuration management and monitoring examples</w:t>
-      </w:r>
-    </w:p>
-    <w:p>
-      <w:r>
-        <w:t>Ansible provides a localhost playbook that checks the public Render /health endpoint and requires SERVICE_URL. Terraform contains a safe provider/version starter but no Render infrastructure resources. Puppet demonstrates package installation for a separately managed Linux monitoring host. Nagios provides an HTTP health-check command and example host/service configuration. These examples do not administer Render infrastructure or its private container host.</w:t>
-      </w:r>
-    </w:p>
-    <w:p>
-      <w:pPr>
-        <w:pStyle w:val="Heading1"/>
-      </w:pPr>
-      <w:r>
-        <w:t>6. Security and Privacy</w:t>
-      </w:r>
-    </w:p>
-    <w:p>
-      <w:pPr>
-        <w:pStyle w:val="Heading2"/>
-      </w:pPr>
-      <w:r>
-        <w:t>Data handling</w:t>
-      </w:r>
-    </w:p>
-    <w:p>
-      <w:r>
-        <w:t>The application processes the uploaded PDF in memory and does not save it to the project uploads directory. Before AI processing, common email addresses, phone numbers, street addresses, and links are redacted. This is partial redaction, not full anonymization; names and other personal details may remain.</w:t>
-      </w:r>
-    </w:p>
-    <w:p>
-      <w:pPr>
-        <w:pStyle w:val="Heading2"/>
-      </w:pPr>
-      <w:r>
-        <w:t>Consent and external processing</w:t>
-      </w:r>
-    </w:p>
-    <w:p>
-      <w:r>
-        <w:t>The interface explains that remaining resume text and job-description text are sent to Groq and requires explicit consent before analysis or optimization. Users should not submit information they are not comfortable sharing with the provider and should review the provider?s data-handling terms.</w:t>
-      </w:r>
-    </w:p>
-    <w:p>
-      <w:pPr>
-        <w:pStyle w:val="Heading2"/>
-      </w:pPr>
-      <w:r>
-        <w:t>Application safeguards</w:t>
-      </w:r>
-    </w:p>
-    <w:p>
-      <w:r>
-        <w:t>API keys are configured through environment variables, .env files are excluded from Git, responses use no-store cache headers, request size is limited, CORS is restricted to local development origins, and Flask debug mode is disabled when the application starts directly.</w:t>
-      </w:r>
-    </w:p>
-    <w:p>
-      <w:pPr>
-        <w:pStyle w:val="Heading2"/>
-      </w:pPr>
-      <w:r>
-        <w:t>Limitations</w:t>
-      </w:r>
-    </w:p>
-    <w:p>
-      <w:r>
-        <w:t>Pattern-based redaction can miss identifiers or remove non-identifying strings. The AI output may be incomplete or incorrect. The ATS-style score is an estimate, not a validated score from a commercial applicant-tracking system. The application does not currently provide account management, persistent history, OCR, or human review.</w:t>
-      </w:r>
-    </w:p>
-    <w:p>
-      <w:pPr>
-        <w:pStyle w:val="Heading1"/>
-      </w:pPr>
-      <w:r>
-        <w:t>7. Testing and Verification</w:t>
-      </w:r>
-    </w:p>
-    <w:p>
-      <w:pPr>
-        <w:pStyle w:val="Heading2"/>
-      </w:pPr>
-      <w:r>
-        <w:t>Automated test suite</w:t>
-      </w:r>
-    </w:p>
-    <w:p>
-      <w:r>
-        <w:t>The repository uses Python unittest. The current suite contains five tests: health endpoint response and no-store header; all report sections rendered without tabs and skills listed first; the Groq client receives the configured default model; a short role title follows the labeled-draft prompt path; and a detailed description retains the no-invented-requirements instruction.</w:t>
-      </w:r>
-    </w:p>
-    <w:p>
-      <w:pPr>
-        <w:pStyle w:val="Heading2"/>
-      </w:pPr>
-      <w:r>
-        <w:t>Validation performed</w:t>
-      </w:r>
-    </w:p>
-    <w:p>
-      <w:r>
-        <w:t>The test command `python -m unittest discover -s tests -v` completed successfully with 5 tests passing during report preparation. The frontend inline JavaScript was also checked with Node.js syntax validation during the latest UI changes.</w:t>
-      </w:r>
-    </w:p>
-    <w:p>
-      <w:pPr>
-        <w:pStyle w:val="Heading2"/>
-      </w:pPr>
-      <w:r>
-        <w:t>Manual verification checklist</w:t>
-      </w:r>
-    </w:p>
-    <w:p>
-      <w:r>
-        <w:t>For a live demonstration, verify that the application opens, /health returns status ok, a text-based PDF can be analyzed after consent, skill matches and gaps appear first, optimization handles both a full description and a title-only draft, and a missing/invalid file produces a clear error. CI and Render deployment state can change after this report is prepared; check the current Actions and Render dashboards before claiming a live run.</w:t>
-      </w:r>
-    </w:p>
-    <w:p>
-      <w:pPr>
-        <w:pStyle w:val="Heading1"/>
-      </w:pPr>
-      <w:r>
-        <w:t>8. Installation and Operation</w:t>
-      </w:r>
-    </w:p>
-    <w:p>
-      <w:pPr>
-        <w:pStyle w:val="Heading2"/>
-      </w:pPr>
-      <w:r>
-        <w:t>Local installation</w:t>
-      </w:r>
-    </w:p>
-    <w:p>
-      <w:r>
-        <w:t>Clone https://github.com/abhijeetkumar51/ai-resume-analyzer, enter the repository directory, install requirements with `python -m pip install -r requirements.txt`, create a private .env file next to app.py with GROQ_API_KEY, then run `python app.py`. Open http://localhost:5000.</w:t>
-      </w:r>
-    </w:p>
-    <w:p>
-      <w:pPr>
-        <w:pStyle w:val="Heading2"/>
-      </w:pPr>
-      <w:r>
-        <w:t>Docker operation</w:t>
-      </w:r>
-    </w:p>
-    <w:p>
-      <w:r>
-        <w:t>Build with `docker build -t ai-resume-analyzer .` and run with `docker run --rm -p 5000:5000 -e GROQ_API_KEY=your_key_here ai-resume-analyzer`. Do not put a real key in a committed file or command history; for regular use, pass secrets through an appropriate local secret mechanism.</w:t>
-      </w:r>
-    </w:p>
-    <w:p>
-      <w:pPr>
-        <w:pStyle w:val="Heading2"/>
-      </w:pPr>
-      <w:r>
-        <w:t>Required configuration</w:t>
-      </w:r>
-    </w:p>
-    <w:p>
-      <w:r>
-        <w:t>GROQ_API_KEY is required for AI features. GROQ_MODEL is optional and defaults to openai/gpt-oss-120b. PORT is read from the environment, defaulting to 5000. HOST defaults to 127.0.0.1 for local execution; the Dockerfile sets it to 0.0.0.0.</w:t>
-      </w:r>
-    </w:p>
-    <w:p>
-      <w:pPr>
-        <w:pStyle w:val="Heading1"/>
-      </w:pPr>
-      <w:r>
-        <w:t>9. Future Enhancements</w:t>
-      </w:r>
-    </w:p>
-    <w:p>
-      <w:pPr>
-        <w:pStyle w:val="Heading2"/>
-      </w:pPr>
-      <w:r>
-        <w:t>Planned improvements</w:t>
-      </w:r>
-    </w:p>
-    <w:p>
-      <w:r>
-        <w:t>Potential future work includes OCR for scanned resumes, richer PDF validation, user-controlled redaction previews, configurable model/provider selection with availability checks, response schema validation, rate limiting, optional user accounts with explicit retention controls, accessibility testing, and expanded integration tests.</w:t>
-      </w:r>
-    </w:p>
-    <w:p>
-      <w:pPr>
-        <w:pStyle w:val="Heading2"/>
-      </w:pPr>
-      <w:r>
-        <w:t>Operational improvements</w:t>
-      </w:r>
-    </w:p>
-    <w:p>
-      <w:r>
-        <w:t>Further work could add dependency/image scanning, pinned GitHub Action revisions, Docker build caching and provenance, deployment smoke tests, monitoring/alerts, and a documented recovery process. Any persistence or analytics feature should be introduced only with a clear privacy policy and user consent.</w:t>
-      </w:r>
-    </w:p>
-    <w:p>
-      <w:pPr>
-        <w:pStyle w:val="Heading1"/>
-      </w:pPr>
-      <w:r>
-        <w:t>10. Conclusion</w:t>
-      </w:r>
-    </w:p>
-    <w:p>
-      <w:pPr>
-        <w:pStyle w:val="Heading2"/>
-      </w:pPr>
-      <w:r>
-        <w:t>Conclusion</w:t>
-      </w:r>
-    </w:p>
-    <w:p>
-      <w:r>
-        <w:t>The project demonstrates an end-to-end AI web application and a practical DevOps workflow: input validation, PDF text extraction, privacy-aware redaction, a hosted model integration, a responsive interface, Docker packaging, automated tests, CI/CD publication, and a Render deployment blueprint. It also distinguishes real deployment responsibilities from starter examples for Ansible, Terraform, Puppet, and Nagios. The result is a useful prototype for resume-to-role comparison, with clear limitations around AI reliability, redaction coverage, and actual ATS scoring.</w:t>
-      </w:r>
-    </w:p>
-    <w:p>
-      <w:pPr>
-        <w:pStyle w:val="Heading1"/>
-      </w:pPr>
-      <w:r>
-        <w:t>References</w:t>
-      </w:r>
-    </w:p>
-    <w:p>
-      <w:pPr>
-        <w:pStyle w:val="ListBullet"/>
-      </w:pPr>
-      <w:r>
-        <w:t>Project repository: https://github.com/abhijeetkumar51/ai-resume-analyzer</w:t>
-      </w:r>
-    </w:p>
-    <w:p>
-      <w:pPr>
-        <w:pStyle w:val="ListBullet"/>
-      </w:pPr>
-      <w:r>
-        <w:t>Groq model documentation: https://console.groq.com/docs/models</w:t>
-      </w:r>
-    </w:p>
-    <w:p>
-      <w:pPr>
-        <w:pStyle w:val="ListBullet"/>
-      </w:pPr>
-      <w:r>
-        <w:t>Flask documentation: https://flask.palletsprojects.com/</w:t>
-      </w:r>
-    </w:p>
-    <w:p>
       <w:pPr>
         <w:pStyle w:val="ListBullet"/>
       </w:pPr>
       <w:r>
         <w:t>Docker documentation: https://docs.docker.com/</w:t>
-      </w:r>
-    </w:p>
-    <w:p>
-      <w:pPr>
-        <w:pStyle w:val="ListBullet"/>
-      </w:pPr>
-      <w:r>
-        <w:t>GitHub Actions documentation: https://docs.github.com/actions</w:t>
       </w:r>
     </w:p>
     <w:p>
@@ -992,7 +2676,7 @@
       <w:headerReference w:type="default" r:id="rId9"/>
       <w:footerReference w:type="default" r:id="rId10"/>
       <w:pgSz w:w="12240" w:h="15840"/>
-      <w:pgMar w:top="1037" w:right="1181" w:bottom="1008" w:left="1181" w:header="720" w:footer="720" w:gutter="0"/>
+      <w:pgMar w:top="1037" w:right="1152" w:bottom="1037" w:left="1152" w:header="720" w:footer="720" w:gutter="0"/>
       <w:cols w:space="720"/>
       <w:docGrid w:linePitch="360"/>
     </w:sectPr>
@@ -1019,7 +2703,7 @@
 <w:hdr xmlns:m="http://schemas.openxmlformats.org/officeDocument/2006/math" xmlns:mc="http://schemas.openxmlformats.org/markup-compatibility/2006" xmlns:mo="http://schemas.microsoft.com/office/mac/office/2008/main" xmlns:mv="urn:schemas-microsoft-com:mac:vml" xmlns:o="urn:schemas-microsoft-com:office:office" xmlns:r="http://schemas.openxmlformats.org/officeDocument/2006/relationships" xmlns:v="urn:schemas-microsoft-com:vml" xmlns:w10="urn:schemas-microsoft-com:office:word" xmlns:w14="http://schemas.microsoft.com/office/word/2010/wordml" xmlns:w="http://schemas.openxmlformats.org/wordprocessingml/2006/main" xmlns:wne="http://schemas.microsoft.com/office/word/2006/wordml" xmlns:wp14="http://schemas.microsoft.com/office/word/2010/wordprocessingDrawing" xmlns:wp="http://schemas.openxmlformats.org/drawingml/2006/wordprocessingDrawing" xmlns:wpc="http://schemas.microsoft.com/office/word/2010/wordprocessingCanvas" xmlns:wpg="http://schemas.microsoft.com/office/word/2010/wordprocessingGroup" xmlns:wpi="http://schemas.microsoft.com/office/word/2010/wordprocessingInk" xmlns:wps="http://schemas.microsoft.com/office/word/2010/wordprocessingShape" mc:Ignorable="w14 wp14">
   <w:p>
     <w:pPr>
-      <w:pStyle w:val="Caption"/>
+      <w:pStyle w:val="Header"/>
       <w:jc w:val="right"/>
     </w:pPr>
     <w:r>
@@ -1397,6 +3081,7 @@
     </w:pPr>
     <w:rPr>
       <w:rFonts w:ascii="Aptos" w:hAnsi="Aptos"/>
+      <w:color w:val="26384B"/>
       <w:sz w:val="20"/>
     </w:rPr>
   </w:style>
@@ -1748,12 +3433,12 @@
       <w:contextualSpacing/>
     </w:pPr>
     <w:rPr>
-      <w:rFonts w:asciiTheme="majorHAnsi" w:eastAsiaTheme="majorEastAsia" w:hAnsiTheme="majorHAnsi" w:cstheme="majorBidi" w:ascii="Aptos Display" w:hAnsi="Aptos Display"/>
+      <w:rFonts w:asciiTheme="majorHAnsi" w:eastAsiaTheme="majorEastAsia" w:hAnsiTheme="majorHAnsi" w:cstheme="majorBidi" w:ascii="Aptos" w:hAnsi="Aptos"/>
       <w:b/>
       <w:color w:val="10233F"/>
       <w:spacing w:val="5"/>
       <w:kern w:val="28"/>
-      <w:sz w:val="58"/>
+      <w:sz w:val="60"/>
       <w:szCs w:val="52"/>
     </w:rPr>
   </w:style>
@@ -13082,6 +14767,17 @@
         <w:shd w:val="clear" w:color="auto" w:fill="FBCAA2" w:themeFill="accent6" w:themeFillTint="7F"/>
       </w:tcPr>
     </w:tblStylePr>
+  </w:style>
+  <w:style w:type="paragraph" w:customStyle="1" w:styleId="ReportCode">
+    <w:name w:val="Report Code"/>
+    <w:pPr>
+      <w:spacing w:after="20"/>
+      <w:ind w:left="240"/>
+    </w:pPr>
+    <w:rPr>
+      <w:rFonts w:ascii="Consolas" w:hAnsi="Consolas"/>
+      <w:sz w:val="16"/>
+    </w:rPr>
   </w:style>
 </w:styles>
 </file>

</xml_diff>

<commit_message>
Record verified DevOps integration evidence
Co-authored-by: Copilot <223556219+Copilot@users.noreply.github.com>
</commit_message>
<xml_diff>
--- a/static/AI_Resume_Analyzer_Project_Report.docx
+++ b/static/AI_Resume_Analyzer_Project_Report.docx
@@ -716,7 +716,7 @@
         <w:pStyle w:val="ListBullet"/>
       </w:pPr>
       <w:r>
-        <w:t>Use community.docker.docker so Ansible configures the monitoring container without SSH.</w:t>
+        <w:t>Use community.docker.docker_api so Ansible configures the monitoring container through the mounted Docker socket without SSH.</w:t>
       </w:r>
     </w:p>
     <w:p>
@@ -1126,7 +1126,7 @@
     </w:p>
     <w:p>
       <w:r>
-        <w:t>ansible/Dockerfile builds an ephemeral control node and installs ansible-core, Docker SDK, and community.docker. The inventory assigns the monitoring container to the Docker connection plugin and localhost to a local connection. The controller needs the Docker socket for this plugin.</w:t>
+        <w:t>ansible/Dockerfile builds an ephemeral control node with ansible-core, the Docker SDK, requests, and community.docker. The inventory uses community.docker.docker_api for the monitoring container and a local connection for localhost. The API plugin connects through the mounted unix:///var/run/docker.sock socket.</w:t>
       </w:r>
     </w:p>
     <w:p>
@@ -1174,7 +1174,7 @@
         <w:pStyle w:val="ReportCode"/>
       </w:pPr>
       <w:r>
-        <w:t xml:space="preserve">          ansible_connection: community.docker.docker</w:t>
+        <w:t xml:space="preserve">          ansible_connection: community.docker.docker_api</w:t>
       </w:r>
     </w:p>
     <w:p>
@@ -1887,7 +1887,7 @@
     </w:p>
     <w:p>
       <w:r>
-        <w:t>The five application tests passed. Terraform provider initialization and terraform validate passed with kreuzwerker/docker 3.9.0. A live local apply was attempted but could not reach Docker Desktop: its status remained starting, the docker-desktop WSL distribution was stopped, and Docker API calls returned HTTP 500. Therefore no successful local Ansible/Puppet execution, Nagios state, or live dashboard has been verified in this session. The GitHub Actions integration job is configured but its result must be checked before claiming end-to-end success.</w:t>
+        <w:t>The five application tests passed locally, and Terraform formatting, initialization, and validation passed with kreuzwerker/docker 3.9.0. GitHub Actions run #36 (commit ceb5987) completed successfully on ubuntu-latest: Terraform created eight resources; Ansible applied Puppet, validated Nagios, restarted Nagios and Apache, and verified the app health JSON as status=ok (ai_configured=false); Terraform destroy cleanup succeeded. The run URL is included in References. The local Docker Desktop engine remained unavailable during this session (status starting, docker-desktop WSL distribution stopped, Docker API HTTP 500), so the local dashboard was not opened and no screenshot is included.</w:t>
       </w:r>
     </w:p>
     <w:p>
@@ -2142,7 +2142,7 @@
     </w:p>
     <w:p>
       <w:r>
-        <w:t>This project combines an AI-assisted resume review application with a coherent DevOps lab: Terraform-managed Docker resources, Ansible orchestration, a Puppet module with package/file/service resources, and a Nagios HTTP service check. The boundary between the local lab and Render avoids unsupported host-access claims. The remaining practical requirement is to run the lab against a healthy Docker Engine, capture genuine integration evidence, and complete the cover placeholders.</w:t>
+        <w:t>This project combines an AI-assisted resume review application with a verified DevOps lab: Terraform-managed Docker resources, Ansible orchestration, a Puppet module with package/file/service resources, and a Nagios HTTP service check. GitHub Actions run #36 verified provisioning, configuration, the app health assertion, and cleanup. The local Docker Desktop engine was still unavailable for a live dashboard demonstration; complete the cover placeholders and capture local UI evidence if required.</w:t>
       </w:r>
     </w:p>
     <w:p>
@@ -2457,7 +2457,7 @@
           </w:tcPr>
           <w:p>
             <w:r>
-              <w:t>Five app tests and Terraform validation passed; live lab evidence is still required.</w:t>
+              <w:t>Five app tests passed; GitHub Actions run #36 provisioned and verified the lab, then cleaned it up. No local dashboard screenshot was captured.</w:t>
             </w:r>
           </w:p>
         </w:tc>
@@ -2573,7 +2573,7 @@
         <w:pStyle w:val="ListBullet"/>
       </w:pPr>
       <w:r>
-        <w:t>How is integration proven? Apply invokes Ansible; Ansible applies Puppet and validates Nagios and the app.</w:t>
+        <w:t>How is integration proven? GitHub Actions run #36 shows Terraform apply invoking Ansible; Ansible applied Puppet, validated Nagios, restarted services, and asserted app health before successful Terraform cleanup.</w:t>
       </w:r>
     </w:p>
     <w:p>
@@ -2670,6 +2670,14 @@
       </w:pPr>
       <w:r>
         <w:t>Render documentation: https://render.com/docs</w:t>
+      </w:r>
+    </w:p>
+    <w:p>
+      <w:pPr>
+        <w:pStyle w:val="ListBullet"/>
+      </w:pPr>
+      <w:r>
+        <w:t>GitHub Actions run #36 (commit ceb5987): https://github.com/abhijeetkumar51/ai-resume-analyzer/actions/runs/41206464641</w:t>
       </w:r>
     </w:p>
     <w:sectPr>

</xml_diff>